<commit_message>
New Tasks of React  Addded
</commit_message>
<xml_diff>
--- a/task 3/Task_3.docx
+++ b/task 3/Task_3.docx
@@ -170,7 +170,7 @@
           <w:sz w:val="72"/>
           <w:szCs w:val="72"/>
         </w:rPr>
-        <w:t>3</w:t>
+        <w:t>11</w:t>
       </w:r>
     </w:p>
     <w:p>
@@ -217,7 +217,7 @@
           <w:sz w:val="72"/>
           <w:szCs w:val="72"/>
         </w:rPr>
-        <w:t xml:space="preserve">        </w:t>
+        <w:t xml:space="preserve">       </w:t>
       </w:r>
       <w:r>
         <w:rPr>
@@ -225,7 +225,7 @@
           <w:sz w:val="72"/>
           <w:szCs w:val="72"/>
         </w:rPr>
-        <w:t>JavaScript</w:t>
+        <w:t xml:space="preserve">        </w:t>
       </w:r>
       <w:r>
         <w:rPr>
@@ -233,25 +233,42 @@
           <w:sz w:val="72"/>
           <w:szCs w:val="72"/>
         </w:rPr>
-        <w:t xml:space="preserve"> ES6+ basic</w:t>
-      </w:r>
-    </w:p>
-    <w:p>
-      <w:pPr>
+        <w:t xml:space="preserve"> </w:t>
+      </w:r>
+      <w:r>
         <w:rPr>
           <w:rFonts w:cstheme="minorHAnsi"/>
           <w:sz w:val="72"/>
           <w:szCs w:val="72"/>
         </w:rPr>
-      </w:pPr>
-      <w:r>
+        <w:t>React Events</w:t>
+      </w:r>
+    </w:p>
+    <w:p>
+      <w:pPr>
         <w:rPr>
           <w:rFonts w:cstheme="minorHAnsi"/>
           <w:sz w:val="72"/>
           <w:szCs w:val="72"/>
         </w:rPr>
-        <w:t xml:space="preserve">   (let/ const, arrow function</w:t>
-      </w:r>
+      </w:pPr>
+      <w:r>
+        <w:rPr>
+          <w:rFonts w:cstheme="minorHAnsi"/>
+          <w:sz w:val="72"/>
+          <w:szCs w:val="72"/>
+        </w:rPr>
+        <w:t xml:space="preserve">          and Handling Forms</w:t>
+      </w:r>
+    </w:p>
+    <w:p>
+      <w:pPr>
+        <w:rPr>
+          <w:rFonts w:cstheme="minorHAnsi"/>
+          <w:sz w:val="72"/>
+          <w:szCs w:val="72"/>
+        </w:rPr>
+      </w:pPr>
     </w:p>
     <w:p>
       <w:pPr>
@@ -266,23 +283,14 @@
       <w:r>
         <w:rPr>
           <w:rFonts w:cstheme="minorHAnsi"/>
-          <w:sz w:val="72"/>
-          <w:szCs w:val="72"/>
-        </w:rPr>
-        <w:t xml:space="preserve">         and template literal)</w:t>
-      </w:r>
-    </w:p>
-    <w:p>
-      <w:pPr>
-        <w:rPr>
-          <w:rFonts w:cstheme="minorHAnsi"/>
-          <w:sz w:val="72"/>
-          <w:szCs w:val="72"/>
-        </w:rPr>
-      </w:pPr>
-    </w:p>
-    <w:p>
-      <w:pPr>
+          <w:b/>
+          <w:sz w:val="40"/>
+          <w:szCs w:val="40"/>
+          <w:u w:val="single"/>
+        </w:rPr>
+        <w:t>Date</w:t>
+      </w:r>
+      <w:r>
         <w:rPr>
           <w:rFonts w:cstheme="minorHAnsi"/>
           <w:b/>
@@ -290,25 +298,6 @@
           <w:szCs w:val="40"/>
           <w:u w:val="single"/>
         </w:rPr>
-      </w:pPr>
-      <w:r>
-        <w:rPr>
-          <w:rFonts w:cstheme="minorHAnsi"/>
-          <w:b/>
-          <w:sz w:val="40"/>
-          <w:szCs w:val="40"/>
-          <w:u w:val="single"/>
-        </w:rPr>
-        <w:t>Date</w:t>
-      </w:r>
-      <w:r>
-        <w:rPr>
-          <w:rFonts w:cstheme="minorHAnsi"/>
-          <w:b/>
-          <w:sz w:val="40"/>
-          <w:szCs w:val="40"/>
-          <w:u w:val="single"/>
-        </w:rPr>
         <w:t>:</w:t>
       </w:r>
     </w:p>
@@ -334,7 +323,7 @@
           <w:sz w:val="72"/>
           <w:szCs w:val="72"/>
         </w:rPr>
-        <w:t>30</w:t>
+        <w:t>21</w:t>
       </w:r>
       <w:r>
         <w:rPr>
@@ -342,8 +331,33 @@
           <w:sz w:val="72"/>
           <w:szCs w:val="72"/>
         </w:rPr>
-        <w:t xml:space="preserve"> June 2025</w:t>
-      </w:r>
+        <w:t xml:space="preserve"> Ju</w:t>
+      </w:r>
+      <w:r>
+        <w:rPr>
+          <w:rFonts w:cstheme="minorHAnsi"/>
+          <w:sz w:val="72"/>
+          <w:szCs w:val="72"/>
+        </w:rPr>
+        <w:t>ly</w:t>
+      </w:r>
+      <w:r>
+        <w:rPr>
+          <w:rFonts w:cstheme="minorHAnsi"/>
+          <w:sz w:val="72"/>
+          <w:szCs w:val="72"/>
+        </w:rPr>
+        <w:t xml:space="preserve"> 2025</w:t>
+      </w:r>
+    </w:p>
+    <w:p>
+      <w:pPr>
+        <w:rPr>
+          <w:rFonts w:cstheme="minorHAnsi"/>
+          <w:sz w:val="72"/>
+          <w:szCs w:val="72"/>
+        </w:rPr>
+      </w:pPr>
     </w:p>
     <w:p>
       <w:pPr>
@@ -385,6 +399,9 @@
           <w:szCs w:val="72"/>
         </w:rPr>
       </w:pPr>
+      <w:bookmarkStart w:id="0" w:name="_GoBack"/>
+      <w:bookmarkEnd w:id="0"/>
+      <w:proofErr w:type="spellStart"/>
       <w:r>
         <w:rPr>
           <w:rFonts w:ascii="Algerian" w:hAnsi="Algerian"/>
@@ -392,9 +409,9 @@
           <w:sz w:val="72"/>
           <w:szCs w:val="72"/>
         </w:rPr>
-        <w:t xml:space="preserve">  </w:t>
-      </w:r>
-      <w:proofErr w:type="spellStart"/>
+        <w:t>Appverse</w:t>
+      </w:r>
+      <w:proofErr w:type="spellEnd"/>
       <w:r>
         <w:rPr>
           <w:rFonts w:ascii="Algerian" w:hAnsi="Algerian"/>
@@ -402,9 +419,8 @@
           <w:sz w:val="72"/>
           <w:szCs w:val="72"/>
         </w:rPr>
-        <w:t>Appverse</w:t>
-      </w:r>
-      <w:proofErr w:type="spellEnd"/>
+        <w:t xml:space="preserve"> techn</w:t>
+      </w:r>
       <w:r>
         <w:rPr>
           <w:rFonts w:ascii="Algerian" w:hAnsi="Algerian"/>
@@ -412,149 +428,427 @@
           <w:sz w:val="72"/>
           <w:szCs w:val="72"/>
         </w:rPr>
-        <w:t xml:space="preserve"> techn</w:t>
-      </w:r>
-      <w:r>
-        <w:rPr>
-          <w:rFonts w:ascii="Algerian" w:hAnsi="Algerian"/>
-          <w:b/>
-          <w:sz w:val="72"/>
-          <w:szCs w:val="72"/>
-        </w:rPr>
         <w:t>ologies</w:t>
       </w:r>
     </w:p>
     <w:p/>
     <w:p>
       <w:pPr>
-        <w:pStyle w:val="Heading1"/>
+        <w:pStyle w:val="Heading2"/>
+        <w:rPr>
+          <w:sz w:val="34"/>
+          <w:szCs w:val="34"/>
+        </w:rPr>
       </w:pPr>
       <w:r>
         <w:rPr>
           <w:rFonts w:ascii="Segoe UI Emoji" w:hAnsi="Segoe UI Emoji" w:cs="Segoe UI Emoji"/>
+          <w:sz w:val="34"/>
+          <w:szCs w:val="34"/>
         </w:rPr>
         <w:lastRenderedPageBreak/>
         <w:t>📘</w:t>
       </w:r>
       <w:r>
-        <w:t xml:space="preserve"> JavaScript ES6+ Learning Report</w:t>
+        <w:rPr>
+          <w:sz w:val="34"/>
+          <w:szCs w:val="34"/>
+        </w:rPr>
+        <w:t xml:space="preserve"> Learning Report: React Events and Handling Forms</w:t>
       </w:r>
     </w:p>
     <w:p>
       <w:pPr>
-        <w:pStyle w:val="NormalWeb"/>
+        <w:pStyle w:val="Heading3"/>
+        <w:rPr>
+          <w:sz w:val="34"/>
+          <w:szCs w:val="34"/>
+        </w:rPr>
       </w:pPr>
       <w:r>
         <w:rPr>
           <w:rStyle w:val="Strong"/>
-        </w:rPr>
-        <w:t>ECMAScript 6 (ES6)</w:t>
-      </w:r>
-      <w:r>
-        <w:t xml:space="preserve">, also known as </w:t>
-      </w:r>
-      <w:r>
-        <w:rPr>
-          <w:rStyle w:val="Strong"/>
-        </w:rPr>
-        <w:t>ES2015</w:t>
-      </w:r>
-      <w:r>
-        <w:t xml:space="preserve">, </w:t>
-      </w:r>
-      <w:bookmarkStart w:id="0" w:name="_GoBack"/>
-      <w:bookmarkEnd w:id="0"/>
-      <w:r>
-        <w:t xml:space="preserve">is a major update to JavaScript that introduced modern features to improve code readability, reusability, and performance. Since ES6, JavaScript continues to evolve with </w:t>
-      </w:r>
-      <w:r>
-        <w:rPr>
-          <w:rStyle w:val="Strong"/>
-        </w:rPr>
-        <w:t>ES7, ES8, ES9...</w:t>
-      </w:r>
-      <w:r>
-        <w:t xml:space="preserve">, hence the term </w:t>
-      </w:r>
-      <w:r>
-        <w:rPr>
-          <w:rStyle w:val="Strong"/>
-        </w:rPr>
-        <w:t>ES6+</w:t>
-      </w:r>
-      <w:r>
-        <w:t xml:space="preserve"> (ES6 and later versions).</w:t>
+          <w:b/>
+          <w:bCs/>
+          <w:sz w:val="34"/>
+          <w:szCs w:val="34"/>
+        </w:rPr>
+        <w:t>1. Introduction</w:t>
       </w:r>
     </w:p>
     <w:p>
-      <w:r>
-        <w:pict w14:anchorId="06342FC1">
-          <v:rect id="_x0000_i1042" style="width:0;height:1.5pt" o:hralign="center" o:hrstd="t" o:hr="t" fillcolor="#a0a0a0" stroked="f"/>
-        </w:pict>
+      <w:pPr>
+        <w:pStyle w:val="NormalWeb"/>
+        <w:rPr>
+          <w:sz w:val="34"/>
+          <w:szCs w:val="34"/>
+        </w:rPr>
+      </w:pPr>
+      <w:r>
+        <w:rPr>
+          <w:sz w:val="34"/>
+          <w:szCs w:val="34"/>
+        </w:rPr>
+        <w:t xml:space="preserve">In React, handling user interactions like clicks, typing, and form submissions is essential for building interactive web applications. React provides its own </w:t>
+      </w:r>
+      <w:r>
+        <w:rPr>
+          <w:rStyle w:val="Strong"/>
+          <w:sz w:val="34"/>
+          <w:szCs w:val="34"/>
+        </w:rPr>
+        <w:t>synthetic event system</w:t>
+      </w:r>
+      <w:r>
+        <w:rPr>
+          <w:sz w:val="34"/>
+          <w:szCs w:val="34"/>
+        </w:rPr>
+        <w:t xml:space="preserve"> to handle events efficiently and consistently across all browsers. Additionally, </w:t>
+      </w:r>
+      <w:r>
+        <w:rPr>
+          <w:rStyle w:val="Strong"/>
+          <w:sz w:val="34"/>
+          <w:szCs w:val="34"/>
+        </w:rPr>
+        <w:t>form handling</w:t>
+      </w:r>
+      <w:r>
+        <w:rPr>
+          <w:sz w:val="34"/>
+          <w:szCs w:val="34"/>
+        </w:rPr>
+        <w:t xml:space="preserve"> in React involves managing inputs through component state and updating the UI in real-time as users interact with the form.</w:t>
       </w:r>
     </w:p>
     <w:p>
       <w:pPr>
-        <w:pStyle w:val="Heading2"/>
-      </w:pPr>
-      <w:r>
-        <w:rPr>
-          <w:rFonts w:ascii="Segoe UI Emoji" w:hAnsi="Segoe UI Emoji" w:cs="Segoe UI Emoji"/>
-        </w:rPr>
-        <w:t>🔹</w:t>
-      </w:r>
-      <w:r>
-        <w:t xml:space="preserve"> 1. </w:t>
-      </w:r>
-      <w:r>
-        <w:rPr>
-          <w:rStyle w:val="HTMLCode"/>
-          <w:rFonts w:eastAsiaTheme="majorEastAsia"/>
-        </w:rPr>
-        <w:t>let</w:t>
-      </w:r>
-      <w:r>
-        <w:t xml:space="preserve">, </w:t>
-      </w:r>
-      <w:r>
-        <w:rPr>
-          <w:rStyle w:val="HTMLCode"/>
-          <w:rFonts w:eastAsiaTheme="majorEastAsia"/>
-        </w:rPr>
-        <w:t>const</w:t>
-      </w:r>
-      <w:r>
-        <w:t xml:space="preserve">, and </w:t>
-      </w:r>
-      <w:r>
-        <w:rPr>
-          <w:rStyle w:val="HTMLCode"/>
-          <w:rFonts w:eastAsiaTheme="majorEastAsia"/>
-        </w:rPr>
-        <w:t>var</w:t>
+        <w:rPr>
+          <w:sz w:val="34"/>
+          <w:szCs w:val="34"/>
+        </w:rPr>
+      </w:pPr>
+      <w:r>
+        <w:rPr>
+          <w:sz w:val="34"/>
+          <w:szCs w:val="34"/>
+        </w:rPr>
+        <w:pict w14:anchorId="0B847365">
+          <v:rect id="_x0000_i1034" style="width:0;height:1.5pt" o:hralign="center" o:hrstd="t" o:hr="t" fillcolor="#a0a0a0" stroked="f"/>
+        </w:pict>
       </w:r>
     </w:p>
     <w:p>
       <w:pPr>
         <w:pStyle w:val="Heading3"/>
-      </w:pPr>
-      <w:r>
-        <w:rPr>
-          <w:rFonts w:ascii="Segoe UI Emoji" w:hAnsi="Segoe UI Emoji" w:cs="Segoe UI Emoji"/>
-        </w:rPr>
-        <w:t>🔸</w:t>
-      </w:r>
-      <w:r>
-        <w:t xml:space="preserve"> </w:t>
-      </w:r>
-      <w:r>
-        <w:rPr>
-          <w:rStyle w:val="HTMLCode"/>
-        </w:rPr>
-        <w:t>var</w:t>
-      </w:r>
-      <w:r>
-        <w:t xml:space="preserve"> (Old Way)</w:t>
+        <w:rPr>
+          <w:sz w:val="34"/>
+          <w:szCs w:val="34"/>
+        </w:rPr>
+      </w:pPr>
+      <w:r>
+        <w:rPr>
+          <w:rStyle w:val="Strong"/>
+          <w:b/>
+          <w:bCs/>
+          <w:sz w:val="34"/>
+          <w:szCs w:val="34"/>
+        </w:rPr>
+        <w:t>2. React Events</w:t>
+      </w:r>
+    </w:p>
+    <w:p>
+      <w:pPr>
+        <w:pStyle w:val="NormalWeb"/>
+        <w:rPr>
+          <w:sz w:val="34"/>
+          <w:szCs w:val="34"/>
+        </w:rPr>
+      </w:pPr>
+      <w:r>
+        <w:rPr>
+          <w:sz w:val="34"/>
+          <w:szCs w:val="34"/>
+        </w:rPr>
+        <w:t xml:space="preserve">React events are similar to DOM events but are wrapped in the </w:t>
+      </w:r>
+      <w:proofErr w:type="spellStart"/>
+      <w:r>
+        <w:rPr>
+          <w:rStyle w:val="Strong"/>
+          <w:sz w:val="34"/>
+          <w:szCs w:val="34"/>
+        </w:rPr>
+        <w:t>SyntheticEvent</w:t>
+      </w:r>
+      <w:proofErr w:type="spellEnd"/>
+      <w:r>
+        <w:rPr>
+          <w:sz w:val="34"/>
+          <w:szCs w:val="34"/>
+        </w:rPr>
+        <w:t xml:space="preserve"> system for cross-browser compatibility.</w:t>
+      </w:r>
+    </w:p>
+    <w:p>
+      <w:pPr>
+        <w:pStyle w:val="Heading4"/>
+        <w:rPr>
+          <w:sz w:val="34"/>
+          <w:szCs w:val="34"/>
+        </w:rPr>
+      </w:pPr>
+      <w:r>
+        <w:rPr>
+          <w:sz w:val="34"/>
+          <w:szCs w:val="34"/>
+        </w:rPr>
+        <w:t>Example of an Event Handler:</w:t>
+      </w:r>
+    </w:p>
+    <w:p>
+      <w:pPr>
+        <w:pStyle w:val="HTMLPreformatted"/>
+        <w:rPr>
+          <w:rStyle w:val="HTMLCode"/>
+          <w:sz w:val="34"/>
+          <w:szCs w:val="34"/>
+        </w:rPr>
+      </w:pPr>
+      <w:r>
+        <w:rPr>
+          <w:rStyle w:val="HTMLCode"/>
+          <w:sz w:val="34"/>
+          <w:szCs w:val="34"/>
+        </w:rPr>
+        <w:t xml:space="preserve">function </w:t>
+      </w:r>
+      <w:proofErr w:type="spellStart"/>
+      <w:proofErr w:type="gramStart"/>
+      <w:r>
+        <w:rPr>
+          <w:rStyle w:val="HTMLCode"/>
+          <w:sz w:val="34"/>
+          <w:szCs w:val="34"/>
+        </w:rPr>
+        <w:t>ClickButton</w:t>
+      </w:r>
+      <w:proofErr w:type="spellEnd"/>
+      <w:r>
+        <w:rPr>
+          <w:rStyle w:val="HTMLCode"/>
+          <w:sz w:val="34"/>
+          <w:szCs w:val="34"/>
+        </w:rPr>
+        <w:t>(</w:t>
+      </w:r>
+      <w:proofErr w:type="gramEnd"/>
+      <w:r>
+        <w:rPr>
+          <w:rStyle w:val="HTMLCode"/>
+          <w:sz w:val="34"/>
+          <w:szCs w:val="34"/>
+        </w:rPr>
+        <w:t>) {</w:t>
+      </w:r>
+    </w:p>
+    <w:p>
+      <w:pPr>
+        <w:pStyle w:val="HTMLPreformatted"/>
+        <w:rPr>
+          <w:rStyle w:val="HTMLCode"/>
+          <w:sz w:val="34"/>
+          <w:szCs w:val="34"/>
+        </w:rPr>
+      </w:pPr>
+      <w:r>
+        <w:rPr>
+          <w:rStyle w:val="HTMLCode"/>
+          <w:sz w:val="34"/>
+          <w:szCs w:val="34"/>
+        </w:rPr>
+        <w:t xml:space="preserve">  function </w:t>
+      </w:r>
+      <w:proofErr w:type="spellStart"/>
+      <w:proofErr w:type="gramStart"/>
+      <w:r>
+        <w:rPr>
+          <w:rStyle w:val="HTMLCode"/>
+          <w:sz w:val="34"/>
+          <w:szCs w:val="34"/>
+        </w:rPr>
+        <w:t>handleClick</w:t>
+      </w:r>
+      <w:proofErr w:type="spellEnd"/>
+      <w:r>
+        <w:rPr>
+          <w:rStyle w:val="HTMLCode"/>
+          <w:sz w:val="34"/>
+          <w:szCs w:val="34"/>
+        </w:rPr>
+        <w:t>(</w:t>
+      </w:r>
+      <w:proofErr w:type="gramEnd"/>
+      <w:r>
+        <w:rPr>
+          <w:rStyle w:val="HTMLCode"/>
+          <w:sz w:val="34"/>
+          <w:szCs w:val="34"/>
+        </w:rPr>
+        <w:t>) {</w:t>
+      </w:r>
+    </w:p>
+    <w:p>
+      <w:pPr>
+        <w:pStyle w:val="HTMLPreformatted"/>
+        <w:rPr>
+          <w:rStyle w:val="HTMLCode"/>
+          <w:sz w:val="34"/>
+          <w:szCs w:val="34"/>
+        </w:rPr>
+      </w:pPr>
+      <w:r>
+        <w:rPr>
+          <w:rStyle w:val="HTMLCode"/>
+          <w:sz w:val="34"/>
+          <w:szCs w:val="34"/>
+        </w:rPr>
+        <w:t xml:space="preserve">    </w:t>
+      </w:r>
+      <w:proofErr w:type="gramStart"/>
+      <w:r>
+        <w:rPr>
+          <w:rStyle w:val="HTMLCode"/>
+          <w:sz w:val="34"/>
+          <w:szCs w:val="34"/>
+        </w:rPr>
+        <w:t>alert(</w:t>
+      </w:r>
+      <w:proofErr w:type="gramEnd"/>
+      <w:r>
+        <w:rPr>
+          <w:rStyle w:val="HTMLCode"/>
+          <w:sz w:val="34"/>
+          <w:szCs w:val="34"/>
+        </w:rPr>
+        <w:t>"Button was clicked!");</w:t>
+      </w:r>
+    </w:p>
+    <w:p>
+      <w:pPr>
+        <w:pStyle w:val="HTMLPreformatted"/>
+        <w:rPr>
+          <w:rStyle w:val="HTMLCode"/>
+          <w:sz w:val="34"/>
+          <w:szCs w:val="34"/>
+        </w:rPr>
+      </w:pPr>
+      <w:r>
+        <w:rPr>
+          <w:rStyle w:val="HTMLCode"/>
+          <w:sz w:val="34"/>
+          <w:szCs w:val="34"/>
+        </w:rPr>
+        <w:t xml:space="preserve">  }</w:t>
+      </w:r>
+    </w:p>
+    <w:p>
+      <w:pPr>
+        <w:pStyle w:val="HTMLPreformatted"/>
+        <w:rPr>
+          <w:rStyle w:val="HTMLCode"/>
+          <w:sz w:val="34"/>
+          <w:szCs w:val="34"/>
+        </w:rPr>
+      </w:pPr>
+    </w:p>
+    <w:p>
+      <w:pPr>
+        <w:pStyle w:val="HTMLPreformatted"/>
+        <w:rPr>
+          <w:rStyle w:val="HTMLCode"/>
+          <w:sz w:val="34"/>
+          <w:szCs w:val="34"/>
+        </w:rPr>
+      </w:pPr>
+      <w:r>
+        <w:rPr>
+          <w:rStyle w:val="HTMLCode"/>
+          <w:sz w:val="34"/>
+          <w:szCs w:val="34"/>
+        </w:rPr>
+        <w:t xml:space="preserve">  return &lt;button </w:t>
+      </w:r>
+      <w:proofErr w:type="spellStart"/>
+      <w:r>
+        <w:rPr>
+          <w:rStyle w:val="HTMLCode"/>
+          <w:sz w:val="34"/>
+          <w:szCs w:val="34"/>
+        </w:rPr>
+        <w:t>onClick</w:t>
+      </w:r>
+      <w:proofErr w:type="spellEnd"/>
+      <w:r>
+        <w:rPr>
+          <w:rStyle w:val="HTMLCode"/>
+          <w:sz w:val="34"/>
+          <w:szCs w:val="34"/>
+        </w:rPr>
+        <w:t>={</w:t>
+      </w:r>
+      <w:proofErr w:type="spellStart"/>
+      <w:r>
+        <w:rPr>
+          <w:rStyle w:val="HTMLCode"/>
+          <w:sz w:val="34"/>
+          <w:szCs w:val="34"/>
+        </w:rPr>
+        <w:t>handleClick</w:t>
+      </w:r>
+      <w:proofErr w:type="spellEnd"/>
+      <w:r>
+        <w:rPr>
+          <w:rStyle w:val="HTMLCode"/>
+          <w:sz w:val="34"/>
+          <w:szCs w:val="34"/>
+        </w:rPr>
+        <w:t>}&gt;Click Me&lt;/button&gt;;</w:t>
+      </w:r>
+    </w:p>
+    <w:p>
+      <w:pPr>
+        <w:pStyle w:val="HTMLPreformatted"/>
+        <w:rPr>
+          <w:rStyle w:val="HTMLCode"/>
+          <w:sz w:val="34"/>
+          <w:szCs w:val="34"/>
+        </w:rPr>
+      </w:pPr>
+      <w:r>
+        <w:rPr>
+          <w:rStyle w:val="HTMLCode"/>
+          <w:sz w:val="34"/>
+          <w:szCs w:val="34"/>
+        </w:rPr>
+        <w:t>}</w:t>
+      </w:r>
+    </w:p>
+    <w:p>
+      <w:pPr>
+        <w:pStyle w:val="Heading4"/>
+        <w:rPr>
+          <w:sz w:val="34"/>
+          <w:szCs w:val="34"/>
+        </w:rPr>
+      </w:pPr>
+      <w:r>
+        <w:rPr>
+          <w:sz w:val="34"/>
+          <w:szCs w:val="34"/>
+        </w:rPr>
+        <w:t>Key Concepts:</w:t>
       </w:r>
     </w:p>
     <w:p>
@@ -562,11 +856,53 @@
         <w:pStyle w:val="NormalWeb"/>
         <w:numPr>
           <w:ilvl w:val="0"/>
-          <w:numId w:val="26"/>
+          <w:numId w:val="33"/>
         </w:numPr>
-      </w:pPr>
-      <w:r>
-        <w:t>Introduced in early versions of JS</w:t>
+        <w:rPr>
+          <w:sz w:val="34"/>
+          <w:szCs w:val="34"/>
+        </w:rPr>
+      </w:pPr>
+      <w:r>
+        <w:rPr>
+          <w:sz w:val="34"/>
+          <w:szCs w:val="34"/>
+        </w:rPr>
+        <w:t xml:space="preserve">Events are attached using camelCase (e.g., </w:t>
+      </w:r>
+      <w:proofErr w:type="spellStart"/>
+      <w:r>
+        <w:rPr>
+          <w:rStyle w:val="HTMLCode"/>
+          <w:sz w:val="34"/>
+          <w:szCs w:val="34"/>
+        </w:rPr>
+        <w:t>onClick</w:t>
+      </w:r>
+      <w:proofErr w:type="spellEnd"/>
+      <w:r>
+        <w:rPr>
+          <w:sz w:val="34"/>
+          <w:szCs w:val="34"/>
+        </w:rPr>
+        <w:t xml:space="preserve">, </w:t>
+      </w:r>
+      <w:proofErr w:type="spellStart"/>
+      <w:r>
+        <w:rPr>
+          <w:rStyle w:val="HTMLCode"/>
+          <w:sz w:val="34"/>
+          <w:szCs w:val="34"/>
+        </w:rPr>
+        <w:t>onChange</w:t>
+      </w:r>
+      <w:proofErr w:type="spellEnd"/>
+      <w:r>
+        <w:rPr>
+          <w:sz w:val="34"/>
+          <w:szCs w:val="34"/>
+        </w:rPr>
+        <w:t>)</w:t>
       </w:r>
     </w:p>
     <w:p>
@@ -574,14 +910,19 @@
         <w:pStyle w:val="NormalWeb"/>
         <w:numPr>
           <w:ilvl w:val="0"/>
-          <w:numId w:val="26"/>
+          <w:numId w:val="33"/>
         </w:numPr>
-      </w:pPr>
-      <w:r>
-        <w:rPr>
-          <w:rStyle w:val="Strong"/>
-        </w:rPr>
-        <w:t>Function-scoped</w:t>
+        <w:rPr>
+          <w:sz w:val="34"/>
+          <w:szCs w:val="34"/>
+        </w:rPr>
+      </w:pPr>
+      <w:r>
+        <w:rPr>
+          <w:sz w:val="34"/>
+          <w:szCs w:val="34"/>
+        </w:rPr>
+        <w:t>Event handlers are passed as functions, not strings</w:t>
       </w:r>
     </w:p>
     <w:p>
@@ -589,26 +930,1171 @@
         <w:pStyle w:val="NormalWeb"/>
         <w:numPr>
           <w:ilvl w:val="0"/>
-          <w:numId w:val="26"/>
+          <w:numId w:val="33"/>
         </w:numPr>
-      </w:pPr>
-      <w:r>
-        <w:t xml:space="preserve">Can be </w:t>
-      </w:r>
+        <w:rPr>
+          <w:sz w:val="34"/>
+          <w:szCs w:val="34"/>
+        </w:rPr>
+      </w:pPr>
+      <w:r>
+        <w:rPr>
+          <w:sz w:val="34"/>
+          <w:szCs w:val="34"/>
+        </w:rPr>
+        <w:t>React automatically provides the event object as a parameter</w:t>
+      </w:r>
+    </w:p>
+    <w:p>
+      <w:pPr>
+        <w:pStyle w:val="Heading4"/>
+        <w:rPr>
+          <w:sz w:val="34"/>
+          <w:szCs w:val="34"/>
+        </w:rPr>
+      </w:pPr>
+      <w:r>
+        <w:rPr>
+          <w:sz w:val="34"/>
+          <w:szCs w:val="34"/>
+        </w:rPr>
+        <w:lastRenderedPageBreak/>
+        <w:t>Common Events in React:</w:t>
+      </w:r>
+    </w:p>
+    <w:tbl>
+      <w:tblPr>
+        <w:tblW w:w="0" w:type="auto"/>
+        <w:tblCellSpacing w:w="15" w:type="dxa"/>
+        <w:tblCellMar>
+          <w:top w:w="15" w:type="dxa"/>
+          <w:left w:w="15" w:type="dxa"/>
+          <w:bottom w:w="15" w:type="dxa"/>
+          <w:right w:w="15" w:type="dxa"/>
+        </w:tblCellMar>
+        <w:tblLook w:val="04A0" w:firstRow="1" w:lastRow="0" w:firstColumn="1" w:lastColumn="0" w:noHBand="0" w:noVBand="1"/>
+      </w:tblPr>
+      <w:tblGrid>
+        <w:gridCol w:w="1634"/>
+        <w:gridCol w:w="1897"/>
+        <w:gridCol w:w="4404"/>
+      </w:tblGrid>
+      <w:tr>
+        <w:trPr>
+          <w:tblHeader/>
+          <w:tblCellSpacing w:w="15" w:type="dxa"/>
+        </w:trPr>
+        <w:tc>
+          <w:tcPr>
+            <w:tcW w:w="0" w:type="auto"/>
+            <w:vAlign w:val="center"/>
+            <w:hideMark/>
+          </w:tcPr>
+          <w:p>
+            <w:pPr>
+              <w:jc w:val="center"/>
+              <w:rPr>
+                <w:b/>
+                <w:bCs/>
+                <w:sz w:val="34"/>
+                <w:szCs w:val="34"/>
+              </w:rPr>
+            </w:pPr>
+            <w:r>
+              <w:rPr>
+                <w:b/>
+                <w:bCs/>
+                <w:sz w:val="34"/>
+                <w:szCs w:val="34"/>
+              </w:rPr>
+              <w:t>Event Type</w:t>
+            </w:r>
+          </w:p>
+        </w:tc>
+        <w:tc>
+          <w:tcPr>
+            <w:tcW w:w="0" w:type="auto"/>
+            <w:vAlign w:val="center"/>
+            <w:hideMark/>
+          </w:tcPr>
+          <w:p>
+            <w:pPr>
+              <w:jc w:val="center"/>
+              <w:rPr>
+                <w:b/>
+                <w:bCs/>
+                <w:sz w:val="34"/>
+                <w:szCs w:val="34"/>
+              </w:rPr>
+            </w:pPr>
+            <w:r>
+              <w:rPr>
+                <w:b/>
+                <w:bCs/>
+                <w:sz w:val="34"/>
+                <w:szCs w:val="34"/>
+              </w:rPr>
+              <w:t>React Event</w:t>
+            </w:r>
+          </w:p>
+        </w:tc>
+        <w:tc>
+          <w:tcPr>
+            <w:tcW w:w="0" w:type="auto"/>
+            <w:vAlign w:val="center"/>
+            <w:hideMark/>
+          </w:tcPr>
+          <w:p>
+            <w:pPr>
+              <w:jc w:val="center"/>
+              <w:rPr>
+                <w:b/>
+                <w:bCs/>
+                <w:sz w:val="34"/>
+                <w:szCs w:val="34"/>
+              </w:rPr>
+            </w:pPr>
+            <w:r>
+              <w:rPr>
+                <w:b/>
+                <w:bCs/>
+                <w:sz w:val="34"/>
+                <w:szCs w:val="34"/>
+              </w:rPr>
+              <w:t>Description</w:t>
+            </w:r>
+          </w:p>
+        </w:tc>
+      </w:tr>
+      <w:tr>
+        <w:trPr>
+          <w:tblCellSpacing w:w="15" w:type="dxa"/>
+        </w:trPr>
+        <w:tc>
+          <w:tcPr>
+            <w:tcW w:w="0" w:type="auto"/>
+            <w:vAlign w:val="center"/>
+            <w:hideMark/>
+          </w:tcPr>
+          <w:p>
+            <w:pPr>
+              <w:rPr>
+                <w:sz w:val="34"/>
+                <w:szCs w:val="34"/>
+              </w:rPr>
+            </w:pPr>
+            <w:r>
+              <w:rPr>
+                <w:sz w:val="34"/>
+                <w:szCs w:val="34"/>
+              </w:rPr>
+              <w:t>Mouse</w:t>
+            </w:r>
+          </w:p>
+        </w:tc>
+        <w:tc>
+          <w:tcPr>
+            <w:tcW w:w="0" w:type="auto"/>
+            <w:vAlign w:val="center"/>
+            <w:hideMark/>
+          </w:tcPr>
+          <w:p>
+            <w:pPr>
+              <w:rPr>
+                <w:sz w:val="34"/>
+                <w:szCs w:val="34"/>
+              </w:rPr>
+            </w:pPr>
+            <w:proofErr w:type="spellStart"/>
+            <w:r>
+              <w:rPr>
+                <w:rStyle w:val="HTMLCode"/>
+                <w:rFonts w:eastAsiaTheme="minorHAnsi"/>
+                <w:sz w:val="34"/>
+                <w:szCs w:val="34"/>
+              </w:rPr>
+              <w:t>onClick</w:t>
+            </w:r>
+            <w:proofErr w:type="spellEnd"/>
+          </w:p>
+        </w:tc>
+        <w:tc>
+          <w:tcPr>
+            <w:tcW w:w="0" w:type="auto"/>
+            <w:vAlign w:val="center"/>
+            <w:hideMark/>
+          </w:tcPr>
+          <w:p>
+            <w:pPr>
+              <w:rPr>
+                <w:sz w:val="34"/>
+                <w:szCs w:val="34"/>
+              </w:rPr>
+            </w:pPr>
+            <w:r>
+              <w:rPr>
+                <w:sz w:val="34"/>
+                <w:szCs w:val="34"/>
+              </w:rPr>
+              <w:t>Fires when element is clicked</w:t>
+            </w:r>
+          </w:p>
+        </w:tc>
+      </w:tr>
+      <w:tr>
+        <w:trPr>
+          <w:tblCellSpacing w:w="15" w:type="dxa"/>
+        </w:trPr>
+        <w:tc>
+          <w:tcPr>
+            <w:tcW w:w="0" w:type="auto"/>
+            <w:vAlign w:val="center"/>
+            <w:hideMark/>
+          </w:tcPr>
+          <w:p>
+            <w:pPr>
+              <w:rPr>
+                <w:sz w:val="34"/>
+                <w:szCs w:val="34"/>
+              </w:rPr>
+            </w:pPr>
+            <w:r>
+              <w:rPr>
+                <w:sz w:val="34"/>
+                <w:szCs w:val="34"/>
+              </w:rPr>
+              <w:t>Keyboard</w:t>
+            </w:r>
+          </w:p>
+        </w:tc>
+        <w:tc>
+          <w:tcPr>
+            <w:tcW w:w="0" w:type="auto"/>
+            <w:vAlign w:val="center"/>
+            <w:hideMark/>
+          </w:tcPr>
+          <w:p>
+            <w:pPr>
+              <w:rPr>
+                <w:sz w:val="34"/>
+                <w:szCs w:val="34"/>
+              </w:rPr>
+            </w:pPr>
+            <w:proofErr w:type="spellStart"/>
+            <w:r>
+              <w:rPr>
+                <w:rStyle w:val="HTMLCode"/>
+                <w:rFonts w:eastAsiaTheme="minorHAnsi"/>
+                <w:sz w:val="34"/>
+                <w:szCs w:val="34"/>
+              </w:rPr>
+              <w:t>onKeyDown</w:t>
+            </w:r>
+            <w:proofErr w:type="spellEnd"/>
+          </w:p>
+        </w:tc>
+        <w:tc>
+          <w:tcPr>
+            <w:tcW w:w="0" w:type="auto"/>
+            <w:vAlign w:val="center"/>
+            <w:hideMark/>
+          </w:tcPr>
+          <w:p>
+            <w:pPr>
+              <w:rPr>
+                <w:sz w:val="34"/>
+                <w:szCs w:val="34"/>
+              </w:rPr>
+            </w:pPr>
+            <w:r>
+              <w:rPr>
+                <w:sz w:val="34"/>
+                <w:szCs w:val="34"/>
+              </w:rPr>
+              <w:t>Fires when key is pressed</w:t>
+            </w:r>
+          </w:p>
+        </w:tc>
+      </w:tr>
+      <w:tr>
+        <w:trPr>
+          <w:tblCellSpacing w:w="15" w:type="dxa"/>
+        </w:trPr>
+        <w:tc>
+          <w:tcPr>
+            <w:tcW w:w="0" w:type="auto"/>
+            <w:vAlign w:val="center"/>
+            <w:hideMark/>
+          </w:tcPr>
+          <w:p>
+            <w:pPr>
+              <w:rPr>
+                <w:sz w:val="34"/>
+                <w:szCs w:val="34"/>
+              </w:rPr>
+            </w:pPr>
+            <w:r>
+              <w:rPr>
+                <w:sz w:val="34"/>
+                <w:szCs w:val="34"/>
+              </w:rPr>
+              <w:t>Form</w:t>
+            </w:r>
+          </w:p>
+        </w:tc>
+        <w:tc>
+          <w:tcPr>
+            <w:tcW w:w="0" w:type="auto"/>
+            <w:vAlign w:val="center"/>
+            <w:hideMark/>
+          </w:tcPr>
+          <w:p>
+            <w:pPr>
+              <w:rPr>
+                <w:sz w:val="34"/>
+                <w:szCs w:val="34"/>
+              </w:rPr>
+            </w:pPr>
+            <w:proofErr w:type="spellStart"/>
+            <w:r>
+              <w:rPr>
+                <w:rStyle w:val="HTMLCode"/>
+                <w:rFonts w:eastAsiaTheme="minorHAnsi"/>
+                <w:sz w:val="34"/>
+                <w:szCs w:val="34"/>
+              </w:rPr>
+              <w:t>onSubmit</w:t>
+            </w:r>
+            <w:proofErr w:type="spellEnd"/>
+          </w:p>
+        </w:tc>
+        <w:tc>
+          <w:tcPr>
+            <w:tcW w:w="0" w:type="auto"/>
+            <w:vAlign w:val="center"/>
+            <w:hideMark/>
+          </w:tcPr>
+          <w:p>
+            <w:pPr>
+              <w:rPr>
+                <w:sz w:val="34"/>
+                <w:szCs w:val="34"/>
+              </w:rPr>
+            </w:pPr>
+            <w:r>
+              <w:rPr>
+                <w:sz w:val="34"/>
+                <w:szCs w:val="34"/>
+              </w:rPr>
+              <w:t>Fires on form submission</w:t>
+            </w:r>
+          </w:p>
+        </w:tc>
+      </w:tr>
+      <w:tr>
+        <w:trPr>
+          <w:tblCellSpacing w:w="15" w:type="dxa"/>
+        </w:trPr>
+        <w:tc>
+          <w:tcPr>
+            <w:tcW w:w="0" w:type="auto"/>
+            <w:vAlign w:val="center"/>
+            <w:hideMark/>
+          </w:tcPr>
+          <w:p>
+            <w:pPr>
+              <w:rPr>
+                <w:sz w:val="34"/>
+                <w:szCs w:val="34"/>
+              </w:rPr>
+            </w:pPr>
+            <w:r>
+              <w:rPr>
+                <w:sz w:val="34"/>
+                <w:szCs w:val="34"/>
+              </w:rPr>
+              <w:t>Input</w:t>
+            </w:r>
+          </w:p>
+        </w:tc>
+        <w:tc>
+          <w:tcPr>
+            <w:tcW w:w="0" w:type="auto"/>
+            <w:vAlign w:val="center"/>
+            <w:hideMark/>
+          </w:tcPr>
+          <w:p>
+            <w:pPr>
+              <w:rPr>
+                <w:sz w:val="34"/>
+                <w:szCs w:val="34"/>
+              </w:rPr>
+            </w:pPr>
+            <w:proofErr w:type="spellStart"/>
+            <w:r>
+              <w:rPr>
+                <w:rStyle w:val="HTMLCode"/>
+                <w:rFonts w:eastAsiaTheme="minorHAnsi"/>
+                <w:sz w:val="34"/>
+                <w:szCs w:val="34"/>
+              </w:rPr>
+              <w:t>onChange</w:t>
+            </w:r>
+            <w:proofErr w:type="spellEnd"/>
+          </w:p>
+        </w:tc>
+        <w:tc>
+          <w:tcPr>
+            <w:tcW w:w="0" w:type="auto"/>
+            <w:vAlign w:val="center"/>
+            <w:hideMark/>
+          </w:tcPr>
+          <w:p>
+            <w:pPr>
+              <w:rPr>
+                <w:sz w:val="34"/>
+                <w:szCs w:val="34"/>
+              </w:rPr>
+            </w:pPr>
+            <w:r>
+              <w:rPr>
+                <w:sz w:val="34"/>
+                <w:szCs w:val="34"/>
+              </w:rPr>
+              <w:t>Fires when input value changes</w:t>
+            </w:r>
+          </w:p>
+        </w:tc>
+      </w:tr>
+    </w:tbl>
+    <w:p>
+      <w:pPr>
+        <w:rPr>
+          <w:sz w:val="34"/>
+          <w:szCs w:val="34"/>
+        </w:rPr>
+      </w:pPr>
+      <w:r>
+        <w:rPr>
+          <w:sz w:val="34"/>
+          <w:szCs w:val="34"/>
+        </w:rPr>
+        <w:pict w14:anchorId="734B9778">
+          <v:rect id="_x0000_i1035" style="width:0;height:1.5pt" o:hralign="center" o:hrstd="t" o:hr="t" fillcolor="#a0a0a0" stroked="f"/>
+        </w:pict>
+      </w:r>
+    </w:p>
+    <w:p>
+      <w:pPr>
+        <w:pStyle w:val="Heading3"/>
+        <w:rPr>
+          <w:sz w:val="34"/>
+          <w:szCs w:val="34"/>
+        </w:rPr>
+      </w:pPr>
       <w:r>
         <w:rPr>
           <w:rStyle w:val="Strong"/>
-        </w:rPr>
-        <w:t>redeclared</w:t>
-      </w:r>
-      <w:r>
-        <w:t xml:space="preserve"> and </w:t>
+          <w:b/>
+          <w:bCs/>
+          <w:sz w:val="34"/>
+          <w:szCs w:val="34"/>
+        </w:rPr>
+        <w:t>3. Handling Forms in React</w:t>
+      </w:r>
+    </w:p>
+    <w:p>
+      <w:pPr>
+        <w:pStyle w:val="NormalWeb"/>
+        <w:rPr>
+          <w:sz w:val="34"/>
+          <w:szCs w:val="34"/>
+        </w:rPr>
+      </w:pPr>
+      <w:r>
+        <w:rPr>
+          <w:sz w:val="34"/>
+          <w:szCs w:val="34"/>
+        </w:rPr>
+        <w:t xml:space="preserve">Form handling in React is often done using </w:t>
       </w:r>
       <w:r>
         <w:rPr>
           <w:rStyle w:val="Strong"/>
-        </w:rPr>
-        <w:t>reassigned</w:t>
+          <w:sz w:val="34"/>
+          <w:szCs w:val="34"/>
+        </w:rPr>
+        <w:t>controlled components</w:t>
+      </w:r>
+      <w:r>
+        <w:rPr>
+          <w:sz w:val="34"/>
+          <w:szCs w:val="34"/>
+        </w:rPr>
+        <w:t>, where input elements derive their value from React state.</w:t>
+      </w:r>
+    </w:p>
+    <w:p>
+      <w:pPr>
+        <w:pStyle w:val="Heading4"/>
+        <w:rPr>
+          <w:sz w:val="34"/>
+          <w:szCs w:val="34"/>
+        </w:rPr>
+      </w:pPr>
+      <w:r>
+        <w:rPr>
+          <w:sz w:val="34"/>
+          <w:szCs w:val="34"/>
+        </w:rPr>
+        <w:t>Example of Controlled Input:</w:t>
+      </w:r>
+    </w:p>
+    <w:p>
+      <w:pPr>
+        <w:pStyle w:val="HTMLPreformatted"/>
+        <w:rPr>
+          <w:rStyle w:val="HTMLCode"/>
+          <w:sz w:val="34"/>
+          <w:szCs w:val="34"/>
+        </w:rPr>
+      </w:pPr>
+      <w:r>
+        <w:rPr>
+          <w:rStyle w:val="HTMLCode"/>
+          <w:sz w:val="34"/>
+          <w:szCs w:val="34"/>
+        </w:rPr>
+        <w:t xml:space="preserve">import </w:t>
+      </w:r>
+      <w:proofErr w:type="gramStart"/>
+      <w:r>
+        <w:rPr>
+          <w:rStyle w:val="HTMLCode"/>
+          <w:sz w:val="34"/>
+          <w:szCs w:val="34"/>
+        </w:rPr>
+        <w:t xml:space="preserve">{ </w:t>
+      </w:r>
+      <w:proofErr w:type="spellStart"/>
+      <w:r>
+        <w:rPr>
+          <w:rStyle w:val="HTMLCode"/>
+          <w:sz w:val="34"/>
+          <w:szCs w:val="34"/>
+        </w:rPr>
+        <w:t>useState</w:t>
+      </w:r>
+      <w:proofErr w:type="spellEnd"/>
+      <w:proofErr w:type="gramEnd"/>
+      <w:r>
+        <w:rPr>
+          <w:rStyle w:val="HTMLCode"/>
+          <w:sz w:val="34"/>
+          <w:szCs w:val="34"/>
+        </w:rPr>
+        <w:t xml:space="preserve"> } from 'react';</w:t>
+      </w:r>
+    </w:p>
+    <w:p>
+      <w:pPr>
+        <w:pStyle w:val="HTMLPreformatted"/>
+        <w:rPr>
+          <w:rStyle w:val="HTMLCode"/>
+          <w:sz w:val="34"/>
+          <w:szCs w:val="34"/>
+        </w:rPr>
+      </w:pPr>
+    </w:p>
+    <w:p>
+      <w:pPr>
+        <w:pStyle w:val="HTMLPreformatted"/>
+        <w:rPr>
+          <w:rStyle w:val="HTMLCode"/>
+          <w:sz w:val="34"/>
+          <w:szCs w:val="34"/>
+        </w:rPr>
+      </w:pPr>
+      <w:r>
+        <w:rPr>
+          <w:rStyle w:val="HTMLCode"/>
+          <w:sz w:val="34"/>
+          <w:szCs w:val="34"/>
+        </w:rPr>
+        <w:t xml:space="preserve">function </w:t>
+      </w:r>
+      <w:proofErr w:type="spellStart"/>
+      <w:proofErr w:type="gramStart"/>
+      <w:r>
+        <w:rPr>
+          <w:rStyle w:val="HTMLCode"/>
+          <w:sz w:val="34"/>
+          <w:szCs w:val="34"/>
+        </w:rPr>
+        <w:t>ContactForm</w:t>
+      </w:r>
+      <w:proofErr w:type="spellEnd"/>
+      <w:r>
+        <w:rPr>
+          <w:rStyle w:val="HTMLCode"/>
+          <w:sz w:val="34"/>
+          <w:szCs w:val="34"/>
+        </w:rPr>
+        <w:t>(</w:t>
+      </w:r>
+      <w:proofErr w:type="gramEnd"/>
+      <w:r>
+        <w:rPr>
+          <w:rStyle w:val="HTMLCode"/>
+          <w:sz w:val="34"/>
+          <w:szCs w:val="34"/>
+        </w:rPr>
+        <w:t>) {</w:t>
+      </w:r>
+    </w:p>
+    <w:p>
+      <w:pPr>
+        <w:pStyle w:val="HTMLPreformatted"/>
+        <w:rPr>
+          <w:rStyle w:val="HTMLCode"/>
+          <w:sz w:val="34"/>
+          <w:szCs w:val="34"/>
+        </w:rPr>
+      </w:pPr>
+      <w:r>
+        <w:rPr>
+          <w:rStyle w:val="HTMLCode"/>
+          <w:sz w:val="34"/>
+          <w:szCs w:val="34"/>
+        </w:rPr>
+        <w:t xml:space="preserve">  const [name, </w:t>
+      </w:r>
+      <w:proofErr w:type="spellStart"/>
+      <w:r>
+        <w:rPr>
+          <w:rStyle w:val="HTMLCode"/>
+          <w:sz w:val="34"/>
+          <w:szCs w:val="34"/>
+        </w:rPr>
+        <w:t>setName</w:t>
+      </w:r>
+      <w:proofErr w:type="spellEnd"/>
+      <w:r>
+        <w:rPr>
+          <w:rStyle w:val="HTMLCode"/>
+          <w:sz w:val="34"/>
+          <w:szCs w:val="34"/>
+        </w:rPr>
+        <w:t xml:space="preserve">] = </w:t>
+      </w:r>
+      <w:proofErr w:type="spellStart"/>
+      <w:proofErr w:type="gramStart"/>
+      <w:r>
+        <w:rPr>
+          <w:rStyle w:val="HTMLCode"/>
+          <w:sz w:val="34"/>
+          <w:szCs w:val="34"/>
+        </w:rPr>
+        <w:t>useState</w:t>
+      </w:r>
+      <w:proofErr w:type="spellEnd"/>
+      <w:r>
+        <w:rPr>
+          <w:rStyle w:val="HTMLCode"/>
+          <w:sz w:val="34"/>
+          <w:szCs w:val="34"/>
+        </w:rPr>
+        <w:t>(</w:t>
+      </w:r>
+      <w:proofErr w:type="gramEnd"/>
+      <w:r>
+        <w:rPr>
+          <w:rStyle w:val="HTMLCode"/>
+          <w:sz w:val="34"/>
+          <w:szCs w:val="34"/>
+        </w:rPr>
+        <w:t>"");</w:t>
+      </w:r>
+    </w:p>
+    <w:p>
+      <w:pPr>
+        <w:pStyle w:val="HTMLPreformatted"/>
+        <w:rPr>
+          <w:rStyle w:val="HTMLCode"/>
+          <w:sz w:val="34"/>
+          <w:szCs w:val="34"/>
+        </w:rPr>
+      </w:pPr>
+    </w:p>
+    <w:p>
+      <w:pPr>
+        <w:pStyle w:val="HTMLPreformatted"/>
+        <w:rPr>
+          <w:rStyle w:val="HTMLCode"/>
+          <w:sz w:val="34"/>
+          <w:szCs w:val="34"/>
+        </w:rPr>
+      </w:pPr>
+      <w:r>
+        <w:rPr>
+          <w:rStyle w:val="HTMLCode"/>
+          <w:sz w:val="34"/>
+          <w:szCs w:val="34"/>
+        </w:rPr>
+        <w:t xml:space="preserve">  function </w:t>
+      </w:r>
+      <w:proofErr w:type="spellStart"/>
+      <w:r>
+        <w:rPr>
+          <w:rStyle w:val="HTMLCode"/>
+          <w:sz w:val="34"/>
+          <w:szCs w:val="34"/>
+        </w:rPr>
+        <w:t>handleSubmit</w:t>
+      </w:r>
+      <w:proofErr w:type="spellEnd"/>
+      <w:r>
+        <w:rPr>
+          <w:rStyle w:val="HTMLCode"/>
+          <w:sz w:val="34"/>
+          <w:szCs w:val="34"/>
+        </w:rPr>
+        <w:t>(event) {</w:t>
+      </w:r>
+    </w:p>
+    <w:p>
+      <w:pPr>
+        <w:pStyle w:val="HTMLPreformatted"/>
+        <w:rPr>
+          <w:rStyle w:val="HTMLCode"/>
+          <w:sz w:val="34"/>
+          <w:szCs w:val="34"/>
+        </w:rPr>
+      </w:pPr>
+      <w:r>
+        <w:rPr>
+          <w:rStyle w:val="HTMLCode"/>
+          <w:sz w:val="34"/>
+          <w:szCs w:val="34"/>
+        </w:rPr>
+        <w:t xml:space="preserve">    </w:t>
+      </w:r>
+      <w:proofErr w:type="spellStart"/>
+      <w:proofErr w:type="gramStart"/>
+      <w:r>
+        <w:rPr>
+          <w:rStyle w:val="HTMLCode"/>
+          <w:sz w:val="34"/>
+          <w:szCs w:val="34"/>
+        </w:rPr>
+        <w:t>event.preventDefault</w:t>
+      </w:r>
+      <w:proofErr w:type="spellEnd"/>
+      <w:proofErr w:type="gramEnd"/>
+      <w:r>
+        <w:rPr>
+          <w:rStyle w:val="HTMLCode"/>
+          <w:sz w:val="34"/>
+          <w:szCs w:val="34"/>
+        </w:rPr>
+        <w:t>();</w:t>
+      </w:r>
+    </w:p>
+    <w:p>
+      <w:pPr>
+        <w:pStyle w:val="HTMLPreformatted"/>
+        <w:rPr>
+          <w:rStyle w:val="HTMLCode"/>
+          <w:sz w:val="34"/>
+          <w:szCs w:val="34"/>
+        </w:rPr>
+      </w:pPr>
+      <w:r>
+        <w:rPr>
+          <w:rStyle w:val="HTMLCode"/>
+          <w:sz w:val="34"/>
+          <w:szCs w:val="34"/>
+        </w:rPr>
+        <w:t xml:space="preserve">    </w:t>
+      </w:r>
+      <w:proofErr w:type="gramStart"/>
+      <w:r>
+        <w:rPr>
+          <w:rStyle w:val="HTMLCode"/>
+          <w:sz w:val="34"/>
+          <w:szCs w:val="34"/>
+        </w:rPr>
+        <w:t>alert(</w:t>
+      </w:r>
+      <w:proofErr w:type="gramEnd"/>
+      <w:r>
+        <w:rPr>
+          <w:rStyle w:val="HTMLCode"/>
+          <w:sz w:val="34"/>
+          <w:szCs w:val="34"/>
+        </w:rPr>
+        <w:t>`Form submitted by ${name}`);</w:t>
+      </w:r>
+    </w:p>
+    <w:p>
+      <w:pPr>
+        <w:pStyle w:val="HTMLPreformatted"/>
+        <w:rPr>
+          <w:rStyle w:val="HTMLCode"/>
+          <w:sz w:val="34"/>
+          <w:szCs w:val="34"/>
+        </w:rPr>
+      </w:pPr>
+      <w:r>
+        <w:rPr>
+          <w:rStyle w:val="HTMLCode"/>
+          <w:sz w:val="34"/>
+          <w:szCs w:val="34"/>
+        </w:rPr>
+        <w:t xml:space="preserve">  }</w:t>
+      </w:r>
+    </w:p>
+    <w:p>
+      <w:pPr>
+        <w:pStyle w:val="HTMLPreformatted"/>
+        <w:rPr>
+          <w:rStyle w:val="HTMLCode"/>
+          <w:sz w:val="34"/>
+          <w:szCs w:val="34"/>
+        </w:rPr>
+      </w:pPr>
+    </w:p>
+    <w:p>
+      <w:pPr>
+        <w:pStyle w:val="HTMLPreformatted"/>
+        <w:rPr>
+          <w:rStyle w:val="HTMLCode"/>
+          <w:sz w:val="34"/>
+          <w:szCs w:val="34"/>
+        </w:rPr>
+      </w:pPr>
+      <w:r>
+        <w:rPr>
+          <w:rStyle w:val="HTMLCode"/>
+          <w:sz w:val="34"/>
+          <w:szCs w:val="34"/>
+        </w:rPr>
+        <w:t xml:space="preserve">  return (</w:t>
+      </w:r>
+    </w:p>
+    <w:p>
+      <w:pPr>
+        <w:pStyle w:val="HTMLPreformatted"/>
+        <w:rPr>
+          <w:rStyle w:val="HTMLCode"/>
+          <w:sz w:val="34"/>
+          <w:szCs w:val="34"/>
+        </w:rPr>
+      </w:pPr>
+      <w:r>
+        <w:rPr>
+          <w:rStyle w:val="HTMLCode"/>
+          <w:sz w:val="34"/>
+          <w:szCs w:val="34"/>
+        </w:rPr>
+        <w:t xml:space="preserve">    &lt;form </w:t>
+      </w:r>
+      <w:proofErr w:type="spellStart"/>
+      <w:r>
+        <w:rPr>
+          <w:rStyle w:val="HTMLCode"/>
+          <w:sz w:val="34"/>
+          <w:szCs w:val="34"/>
+        </w:rPr>
+        <w:t>onSubmit</w:t>
+      </w:r>
+      <w:proofErr w:type="spellEnd"/>
+      <w:r>
+        <w:rPr>
+          <w:rStyle w:val="HTMLCode"/>
+          <w:sz w:val="34"/>
+          <w:szCs w:val="34"/>
+        </w:rPr>
+        <w:t>={</w:t>
+      </w:r>
+      <w:proofErr w:type="spellStart"/>
+      <w:r>
+        <w:rPr>
+          <w:rStyle w:val="HTMLCode"/>
+          <w:sz w:val="34"/>
+          <w:szCs w:val="34"/>
+        </w:rPr>
+        <w:t>handleSubmit</w:t>
+      </w:r>
+      <w:proofErr w:type="spellEnd"/>
+      <w:r>
+        <w:rPr>
+          <w:rStyle w:val="HTMLCode"/>
+          <w:sz w:val="34"/>
+          <w:szCs w:val="34"/>
+        </w:rPr>
+        <w:t>}&gt;</w:t>
+      </w:r>
+    </w:p>
+    <w:p>
+      <w:pPr>
+        <w:pStyle w:val="HTMLPreformatted"/>
+        <w:rPr>
+          <w:rStyle w:val="HTMLCode"/>
+          <w:sz w:val="34"/>
+          <w:szCs w:val="34"/>
+        </w:rPr>
+      </w:pPr>
+      <w:r>
+        <w:rPr>
+          <w:rStyle w:val="HTMLCode"/>
+          <w:sz w:val="34"/>
+          <w:szCs w:val="34"/>
+        </w:rPr>
+        <w:t xml:space="preserve">      &lt;input</w:t>
+      </w:r>
+    </w:p>
+    <w:p>
+      <w:pPr>
+        <w:pStyle w:val="HTMLPreformatted"/>
+        <w:rPr>
+          <w:rStyle w:val="HTMLCode"/>
+          <w:sz w:val="34"/>
+          <w:szCs w:val="34"/>
+        </w:rPr>
+      </w:pPr>
+      <w:r>
+        <w:rPr>
+          <w:rStyle w:val="HTMLCode"/>
+          <w:sz w:val="34"/>
+          <w:szCs w:val="34"/>
+        </w:rPr>
+        <w:t xml:space="preserve">        type="text"</w:t>
+      </w:r>
+    </w:p>
+    <w:p>
+      <w:pPr>
+        <w:pStyle w:val="HTMLPreformatted"/>
+        <w:rPr>
+          <w:rStyle w:val="HTMLCode"/>
+          <w:sz w:val="34"/>
+          <w:szCs w:val="34"/>
+        </w:rPr>
+      </w:pPr>
+      <w:r>
+        <w:rPr>
+          <w:rStyle w:val="HTMLCode"/>
+          <w:sz w:val="34"/>
+          <w:szCs w:val="34"/>
+        </w:rPr>
+        <w:t xml:space="preserve">        value={name}</w:t>
+      </w:r>
+    </w:p>
+    <w:p>
+      <w:pPr>
+        <w:pStyle w:val="HTMLPreformatted"/>
+        <w:rPr>
+          <w:rStyle w:val="HTMLCode"/>
+          <w:sz w:val="34"/>
+          <w:szCs w:val="34"/>
+        </w:rPr>
+      </w:pPr>
+      <w:r>
+        <w:rPr>
+          <w:rStyle w:val="HTMLCode"/>
+          <w:sz w:val="34"/>
+          <w:szCs w:val="34"/>
+        </w:rPr>
+        <w:lastRenderedPageBreak/>
+        <w:t xml:space="preserve">        </w:t>
+      </w:r>
+      <w:proofErr w:type="spellStart"/>
+      <w:r>
+        <w:rPr>
+          <w:rStyle w:val="HTMLCode"/>
+          <w:sz w:val="34"/>
+          <w:szCs w:val="34"/>
+        </w:rPr>
+        <w:t>onChange</w:t>
+      </w:r>
+      <w:proofErr w:type="spellEnd"/>
+      <w:r>
+        <w:rPr>
+          <w:rStyle w:val="HTMLCode"/>
+          <w:sz w:val="34"/>
+          <w:szCs w:val="34"/>
+        </w:rPr>
+        <w:t xml:space="preserve">={(e) =&gt; </w:t>
+      </w:r>
+      <w:proofErr w:type="spellStart"/>
+      <w:r>
+        <w:rPr>
+          <w:rStyle w:val="HTMLCode"/>
+          <w:sz w:val="34"/>
+          <w:szCs w:val="34"/>
+        </w:rPr>
+        <w:t>setName</w:t>
+      </w:r>
+      <w:proofErr w:type="spellEnd"/>
+      <w:r>
+        <w:rPr>
+          <w:rStyle w:val="HTMLCode"/>
+          <w:sz w:val="34"/>
+          <w:szCs w:val="34"/>
+        </w:rPr>
+        <w:t>(</w:t>
+      </w:r>
+      <w:proofErr w:type="spellStart"/>
+      <w:proofErr w:type="gramStart"/>
+      <w:r>
+        <w:rPr>
+          <w:rStyle w:val="HTMLCode"/>
+          <w:sz w:val="34"/>
+          <w:szCs w:val="34"/>
+        </w:rPr>
+        <w:t>e.target</w:t>
+      </w:r>
+      <w:proofErr w:type="gramEnd"/>
+      <w:r>
+        <w:rPr>
+          <w:rStyle w:val="HTMLCode"/>
+          <w:sz w:val="34"/>
+          <w:szCs w:val="34"/>
+        </w:rPr>
+        <w:t>.value</w:t>
+      </w:r>
+      <w:proofErr w:type="spellEnd"/>
+      <w:r>
+        <w:rPr>
+          <w:rStyle w:val="HTMLCode"/>
+          <w:sz w:val="34"/>
+          <w:szCs w:val="34"/>
+        </w:rPr>
+        <w:t>)}</w:t>
+      </w:r>
+    </w:p>
+    <w:p>
+      <w:pPr>
+        <w:pStyle w:val="HTMLPreformatted"/>
+        <w:rPr>
+          <w:rStyle w:val="HTMLCode"/>
+          <w:sz w:val="34"/>
+          <w:szCs w:val="34"/>
+        </w:rPr>
+      </w:pPr>
+      <w:r>
+        <w:rPr>
+          <w:rStyle w:val="HTMLCode"/>
+          <w:sz w:val="34"/>
+          <w:szCs w:val="34"/>
+        </w:rPr>
+        <w:t xml:space="preserve">        placeholder="Enter your name"</w:t>
+      </w:r>
+    </w:p>
+    <w:p>
+      <w:pPr>
+        <w:pStyle w:val="HTMLPreformatted"/>
+        <w:rPr>
+          <w:rStyle w:val="HTMLCode"/>
+          <w:sz w:val="34"/>
+          <w:szCs w:val="34"/>
+        </w:rPr>
+      </w:pPr>
+      <w:r>
+        <w:rPr>
+          <w:rStyle w:val="HTMLCode"/>
+          <w:sz w:val="34"/>
+          <w:szCs w:val="34"/>
+        </w:rPr>
+        <w:t xml:space="preserve">      /&gt;</w:t>
+      </w:r>
+    </w:p>
+    <w:p>
+      <w:pPr>
+        <w:pStyle w:val="HTMLPreformatted"/>
+        <w:rPr>
+          <w:rStyle w:val="HTMLCode"/>
+          <w:sz w:val="34"/>
+          <w:szCs w:val="34"/>
+        </w:rPr>
+      </w:pPr>
+      <w:r>
+        <w:rPr>
+          <w:rStyle w:val="HTMLCode"/>
+          <w:sz w:val="34"/>
+          <w:szCs w:val="34"/>
+        </w:rPr>
+        <w:t xml:space="preserve">      &lt;button type="submit"&gt;Submit&lt;/button&gt;</w:t>
+      </w:r>
+    </w:p>
+    <w:p>
+      <w:pPr>
+        <w:pStyle w:val="HTMLPreformatted"/>
+        <w:rPr>
+          <w:rStyle w:val="HTMLCode"/>
+          <w:sz w:val="34"/>
+          <w:szCs w:val="34"/>
+        </w:rPr>
+      </w:pPr>
+      <w:r>
+        <w:rPr>
+          <w:rStyle w:val="HTMLCode"/>
+          <w:sz w:val="34"/>
+          <w:szCs w:val="34"/>
+        </w:rPr>
+        <w:t xml:space="preserve">    &lt;/form&gt;</w:t>
+      </w:r>
+    </w:p>
+    <w:p>
+      <w:pPr>
+        <w:pStyle w:val="HTMLPreformatted"/>
+        <w:rPr>
+          <w:rStyle w:val="HTMLCode"/>
+          <w:sz w:val="34"/>
+          <w:szCs w:val="34"/>
+        </w:rPr>
+      </w:pPr>
+      <w:r>
+        <w:rPr>
+          <w:rStyle w:val="HTMLCode"/>
+          <w:sz w:val="34"/>
+          <w:szCs w:val="34"/>
+        </w:rPr>
+        <w:t xml:space="preserve">  );</w:t>
+      </w:r>
+    </w:p>
+    <w:p>
+      <w:pPr>
+        <w:pStyle w:val="HTMLPreformatted"/>
+        <w:rPr>
+          <w:rStyle w:val="HTMLCode"/>
+          <w:sz w:val="34"/>
+          <w:szCs w:val="34"/>
+        </w:rPr>
+      </w:pPr>
+      <w:r>
+        <w:rPr>
+          <w:rStyle w:val="HTMLCode"/>
+          <w:sz w:val="34"/>
+          <w:szCs w:val="34"/>
+        </w:rPr>
+        <w:t>}</w:t>
+      </w:r>
+    </w:p>
+    <w:p>
+      <w:pPr>
+        <w:pStyle w:val="Heading4"/>
+        <w:rPr>
+          <w:sz w:val="34"/>
+          <w:szCs w:val="34"/>
+        </w:rPr>
+      </w:pPr>
+      <w:r>
+        <w:rPr>
+          <w:sz w:val="34"/>
+          <w:szCs w:val="34"/>
+        </w:rPr>
+        <w:t>Key Features:</w:t>
       </w:r>
     </w:p>
     <w:p>
@@ -616,88 +2102,74 @@
         <w:pStyle w:val="NormalWeb"/>
         <w:numPr>
           <w:ilvl w:val="0"/>
-          <w:numId w:val="26"/>
+          <w:numId w:val="34"/>
         </w:numPr>
-      </w:pPr>
-      <w:r>
-        <w:t>Hoisted (moved to top of function scope)</w:t>
-      </w:r>
-    </w:p>
-    <w:p>
-      <w:pPr>
-        <w:pStyle w:val="HTMLPreformatted"/>
-        <w:rPr>
-          <w:rStyle w:val="HTMLCode"/>
-        </w:rPr>
-      </w:pPr>
-      <w:r>
-        <w:rPr>
-          <w:rStyle w:val="HTMLCode"/>
-        </w:rPr>
-        <w:t>var x = 10;</w:t>
-      </w:r>
-    </w:p>
-    <w:p>
-      <w:pPr>
-        <w:pStyle w:val="HTMLPreformatted"/>
-        <w:rPr>
-          <w:rStyle w:val="HTMLCode"/>
-        </w:rPr>
-      </w:pPr>
-      <w:r>
-        <w:rPr>
-          <w:rStyle w:val="HTMLCode"/>
-        </w:rPr>
-        <w:t>var x = 20; /</w:t>
-      </w:r>
-      <w:proofErr w:type="gramStart"/>
-      <w:r>
-        <w:rPr>
-          <w:rStyle w:val="HTMLCode"/>
-        </w:rPr>
-        <w:t>/  no</w:t>
-      </w:r>
-      <w:proofErr w:type="gramEnd"/>
-      <w:r>
-        <w:rPr>
-          <w:rStyle w:val="HTMLCode"/>
-        </w:rPr>
-        <w:t xml:space="preserve"> error</w:t>
-      </w:r>
-    </w:p>
-    <w:p>
-      <w:pPr>
-        <w:pStyle w:val="Heading3"/>
-      </w:pPr>
-      <w:r>
-        <w:rPr>
-          <w:rFonts w:ascii="Segoe UI Emoji" w:hAnsi="Segoe UI Emoji" w:cs="Segoe UI Emoji"/>
-        </w:rPr>
-        <w:t>🔸</w:t>
-      </w:r>
-      <w:r>
-        <w:t xml:space="preserve"> </w:t>
-      </w:r>
-      <w:r>
-        <w:rPr>
-          <w:rStyle w:val="HTMLCode"/>
-        </w:rPr>
-        <w:t>let</w:t>
-      </w:r>
-      <w:r>
-        <w:t xml:space="preserve"> (Modern Way)</w:t>
-      </w:r>
+        <w:rPr>
+          <w:sz w:val="34"/>
+          <w:szCs w:val="34"/>
+        </w:rPr>
+      </w:pPr>
+      <w:r>
+        <w:rPr>
+          <w:sz w:val="34"/>
+          <w:szCs w:val="34"/>
+        </w:rPr>
+        <w:t xml:space="preserve">Input field is </w:t>
+      </w:r>
+      <w:r>
+        <w:rPr>
+          <w:rStyle w:val="Strong"/>
+          <w:sz w:val="34"/>
+          <w:szCs w:val="34"/>
+        </w:rPr>
+        <w:t>controlled</w:t>
+      </w:r>
+      <w:r>
+        <w:rPr>
+          <w:sz w:val="34"/>
+          <w:szCs w:val="34"/>
+        </w:rPr>
+        <w:t xml:space="preserve"> using </w:t>
+      </w:r>
+      <w:proofErr w:type="spellStart"/>
+      <w:r>
+        <w:rPr>
+          <w:rStyle w:val="HTMLCode"/>
+          <w:sz w:val="34"/>
+          <w:szCs w:val="34"/>
+        </w:rPr>
+        <w:t>useState</w:t>
+      </w:r>
+      <w:proofErr w:type="spellEnd"/>
     </w:p>
     <w:p>
       <w:pPr>
         <w:pStyle w:val="NormalWeb"/>
         <w:numPr>
           <w:ilvl w:val="0"/>
-          <w:numId w:val="27"/>
+          <w:numId w:val="34"/>
         </w:numPr>
-      </w:pPr>
-      <w:r>
-        <w:t>Introduced in ES6</w:t>
+        <w:rPr>
+          <w:sz w:val="34"/>
+          <w:szCs w:val="34"/>
+        </w:rPr>
+      </w:pPr>
+      <w:proofErr w:type="spellStart"/>
+      <w:r>
+        <w:rPr>
+          <w:rStyle w:val="HTMLCode"/>
+          <w:sz w:val="34"/>
+          <w:szCs w:val="34"/>
+        </w:rPr>
+        <w:t>onChange</w:t>
+      </w:r>
+      <w:proofErr w:type="spellEnd"/>
+      <w:r>
+        <w:rPr>
+          <w:sz w:val="34"/>
+          <w:szCs w:val="34"/>
+        </w:rPr>
+        <w:t xml:space="preserve"> updates the state on each keystroke</w:t>
       </w:r>
     </w:p>
     <w:p>
@@ -705,1082 +2177,404 @@
         <w:pStyle w:val="NormalWeb"/>
         <w:numPr>
           <w:ilvl w:val="0"/>
-          <w:numId w:val="27"/>
+          <w:numId w:val="34"/>
         </w:numPr>
-      </w:pPr>
-      <w:r>
-        <w:rPr>
-          <w:rStyle w:val="Strong"/>
-        </w:rPr>
-        <w:t>Block-scoped</w:t>
-      </w:r>
-      <w:r>
-        <w:t xml:space="preserve"> (works inside </w:t>
-      </w:r>
-      <w:r>
-        <w:rPr>
-          <w:rStyle w:val="HTMLCode"/>
-        </w:rPr>
-        <w:t>{}</w:t>
-      </w:r>
-      <w:r>
-        <w:t>)</w:t>
+        <w:rPr>
+          <w:sz w:val="34"/>
+          <w:szCs w:val="34"/>
+        </w:rPr>
+      </w:pPr>
+      <w:proofErr w:type="spellStart"/>
+      <w:r>
+        <w:rPr>
+          <w:rStyle w:val="HTMLCode"/>
+          <w:sz w:val="34"/>
+          <w:szCs w:val="34"/>
+        </w:rPr>
+        <w:t>onSubmit</w:t>
+      </w:r>
+      <w:proofErr w:type="spellEnd"/>
+      <w:r>
+        <w:rPr>
+          <w:sz w:val="34"/>
+          <w:szCs w:val="34"/>
+        </w:rPr>
+        <w:t xml:space="preserve"> prevents default browser reload and handles form logic</w:t>
       </w:r>
     </w:p>
     <w:p>
       <w:pPr>
-        <w:pStyle w:val="NormalWeb"/>
-        <w:numPr>
-          <w:ilvl w:val="0"/>
-          <w:numId w:val="27"/>
-        </w:numPr>
-      </w:pPr>
-      <w:r>
-        <w:t>Cannot be redeclared in the same block</w:t>
+        <w:rPr>
+          <w:sz w:val="34"/>
+          <w:szCs w:val="34"/>
+        </w:rPr>
+      </w:pPr>
+      <w:r>
+        <w:rPr>
+          <w:sz w:val="34"/>
+          <w:szCs w:val="34"/>
+        </w:rPr>
+        <w:pict w14:anchorId="35FED61F">
+          <v:rect id="_x0000_i1036" style="width:0;height:1.5pt" o:hralign="center" o:hrstd="t" o:hr="t" fillcolor="#a0a0a0" stroked="f"/>
+        </w:pict>
       </w:r>
     </w:p>
     <w:p>
       <w:pPr>
-        <w:pStyle w:val="NormalWeb"/>
-        <w:numPr>
-          <w:ilvl w:val="0"/>
-          <w:numId w:val="27"/>
-        </w:numPr>
-      </w:pPr>
-      <w:r>
-        <w:t>Can be reassigned</w:t>
+        <w:pStyle w:val="Heading3"/>
+        <w:rPr>
+          <w:sz w:val="34"/>
+          <w:szCs w:val="34"/>
+        </w:rPr>
+      </w:pPr>
+      <w:r>
+        <w:rPr>
+          <w:rStyle w:val="Strong"/>
+          <w:b/>
+          <w:bCs/>
+          <w:sz w:val="34"/>
+          <w:szCs w:val="34"/>
+        </w:rPr>
+        <w:t>4. Uncontrolled vs Controlled Components</w:t>
       </w:r>
     </w:p>
+    <w:tbl>
+      <w:tblPr>
+        <w:tblW w:w="0" w:type="auto"/>
+        <w:tblCellSpacing w:w="15" w:type="dxa"/>
+        <w:tblCellMar>
+          <w:top w:w="15" w:type="dxa"/>
+          <w:left w:w="15" w:type="dxa"/>
+          <w:bottom w:w="15" w:type="dxa"/>
+          <w:right w:w="15" w:type="dxa"/>
+        </w:tblCellMar>
+        <w:tblLook w:val="04A0" w:firstRow="1" w:lastRow="0" w:firstColumn="1" w:lastColumn="0" w:noHBand="0" w:noVBand="1"/>
+      </w:tblPr>
+      <w:tblGrid>
+        <w:gridCol w:w="1709"/>
+        <w:gridCol w:w="4193"/>
+        <w:gridCol w:w="3458"/>
+      </w:tblGrid>
+      <w:tr>
+        <w:trPr>
+          <w:tblHeader/>
+          <w:tblCellSpacing w:w="15" w:type="dxa"/>
+        </w:trPr>
+        <w:tc>
+          <w:tcPr>
+            <w:tcW w:w="0" w:type="auto"/>
+            <w:vAlign w:val="center"/>
+            <w:hideMark/>
+          </w:tcPr>
+          <w:p>
+            <w:pPr>
+              <w:jc w:val="center"/>
+              <w:rPr>
+                <w:b/>
+                <w:bCs/>
+                <w:sz w:val="34"/>
+                <w:szCs w:val="34"/>
+              </w:rPr>
+            </w:pPr>
+            <w:r>
+              <w:rPr>
+                <w:b/>
+                <w:bCs/>
+                <w:sz w:val="34"/>
+                <w:szCs w:val="34"/>
+              </w:rPr>
+              <w:t>Feature</w:t>
+            </w:r>
+          </w:p>
+        </w:tc>
+        <w:tc>
+          <w:tcPr>
+            <w:tcW w:w="0" w:type="auto"/>
+            <w:vAlign w:val="center"/>
+            <w:hideMark/>
+          </w:tcPr>
+          <w:p>
+            <w:pPr>
+              <w:jc w:val="center"/>
+              <w:rPr>
+                <w:b/>
+                <w:bCs/>
+                <w:sz w:val="34"/>
+                <w:szCs w:val="34"/>
+              </w:rPr>
+            </w:pPr>
+            <w:r>
+              <w:rPr>
+                <w:b/>
+                <w:bCs/>
+                <w:sz w:val="34"/>
+                <w:szCs w:val="34"/>
+              </w:rPr>
+              <w:t>Controlled Component</w:t>
+            </w:r>
+          </w:p>
+        </w:tc>
+        <w:tc>
+          <w:tcPr>
+            <w:tcW w:w="0" w:type="auto"/>
+            <w:vAlign w:val="center"/>
+            <w:hideMark/>
+          </w:tcPr>
+          <w:p>
+            <w:pPr>
+              <w:jc w:val="center"/>
+              <w:rPr>
+                <w:b/>
+                <w:bCs/>
+                <w:sz w:val="34"/>
+                <w:szCs w:val="34"/>
+              </w:rPr>
+            </w:pPr>
+            <w:r>
+              <w:rPr>
+                <w:b/>
+                <w:bCs/>
+                <w:sz w:val="34"/>
+                <w:szCs w:val="34"/>
+              </w:rPr>
+              <w:t>Uncontrolled Component</w:t>
+            </w:r>
+          </w:p>
+        </w:tc>
+      </w:tr>
+      <w:tr>
+        <w:trPr>
+          <w:tblCellSpacing w:w="15" w:type="dxa"/>
+        </w:trPr>
+        <w:tc>
+          <w:tcPr>
+            <w:tcW w:w="0" w:type="auto"/>
+            <w:vAlign w:val="center"/>
+            <w:hideMark/>
+          </w:tcPr>
+          <w:p>
+            <w:pPr>
+              <w:rPr>
+                <w:sz w:val="34"/>
+                <w:szCs w:val="34"/>
+              </w:rPr>
+            </w:pPr>
+            <w:r>
+              <w:rPr>
+                <w:sz w:val="34"/>
+                <w:szCs w:val="34"/>
+              </w:rPr>
+              <w:t>Data source</w:t>
+            </w:r>
+          </w:p>
+        </w:tc>
+        <w:tc>
+          <w:tcPr>
+            <w:tcW w:w="0" w:type="auto"/>
+            <w:vAlign w:val="center"/>
+            <w:hideMark/>
+          </w:tcPr>
+          <w:p>
+            <w:pPr>
+              <w:rPr>
+                <w:sz w:val="34"/>
+                <w:szCs w:val="34"/>
+              </w:rPr>
+            </w:pPr>
+            <w:r>
+              <w:rPr>
+                <w:sz w:val="34"/>
+                <w:szCs w:val="34"/>
+              </w:rPr>
+              <w:t>React state</w:t>
+            </w:r>
+          </w:p>
+        </w:tc>
+        <w:tc>
+          <w:tcPr>
+            <w:tcW w:w="0" w:type="auto"/>
+            <w:vAlign w:val="center"/>
+            <w:hideMark/>
+          </w:tcPr>
+          <w:p>
+            <w:pPr>
+              <w:rPr>
+                <w:sz w:val="34"/>
+                <w:szCs w:val="34"/>
+              </w:rPr>
+            </w:pPr>
+            <w:r>
+              <w:rPr>
+                <w:sz w:val="34"/>
+                <w:szCs w:val="34"/>
+              </w:rPr>
+              <w:t xml:space="preserve">DOM (via </w:t>
+            </w:r>
+            <w:r>
+              <w:rPr>
+                <w:rStyle w:val="HTMLCode"/>
+                <w:rFonts w:eastAsiaTheme="minorHAnsi"/>
+                <w:sz w:val="34"/>
+                <w:szCs w:val="34"/>
+              </w:rPr>
+              <w:t>ref</w:t>
+            </w:r>
+            <w:r>
+              <w:rPr>
+                <w:sz w:val="34"/>
+                <w:szCs w:val="34"/>
+              </w:rPr>
+              <w:t>)</w:t>
+            </w:r>
+          </w:p>
+        </w:tc>
+      </w:tr>
+      <w:tr>
+        <w:trPr>
+          <w:tblCellSpacing w:w="15" w:type="dxa"/>
+        </w:trPr>
+        <w:tc>
+          <w:tcPr>
+            <w:tcW w:w="0" w:type="auto"/>
+            <w:vAlign w:val="center"/>
+            <w:hideMark/>
+          </w:tcPr>
+          <w:p>
+            <w:pPr>
+              <w:rPr>
+                <w:sz w:val="34"/>
+                <w:szCs w:val="34"/>
+              </w:rPr>
+            </w:pPr>
+            <w:r>
+              <w:rPr>
+                <w:sz w:val="34"/>
+                <w:szCs w:val="34"/>
+              </w:rPr>
+              <w:t>React Control</w:t>
+            </w:r>
+          </w:p>
+        </w:tc>
+        <w:tc>
+          <w:tcPr>
+            <w:tcW w:w="0" w:type="auto"/>
+            <w:vAlign w:val="center"/>
+            <w:hideMark/>
+          </w:tcPr>
+          <w:p>
+            <w:pPr>
+              <w:rPr>
+                <w:sz w:val="34"/>
+                <w:szCs w:val="34"/>
+              </w:rPr>
+            </w:pPr>
+            <w:r>
+              <w:rPr>
+                <w:sz w:val="34"/>
+                <w:szCs w:val="34"/>
+              </w:rPr>
+              <w:t>Full control over input</w:t>
+            </w:r>
+          </w:p>
+        </w:tc>
+        <w:tc>
+          <w:tcPr>
+            <w:tcW w:w="0" w:type="auto"/>
+            <w:vAlign w:val="center"/>
+            <w:hideMark/>
+          </w:tcPr>
+          <w:p>
+            <w:pPr>
+              <w:rPr>
+                <w:sz w:val="34"/>
+                <w:szCs w:val="34"/>
+              </w:rPr>
+            </w:pPr>
+            <w:r>
+              <w:rPr>
+                <w:sz w:val="34"/>
+                <w:szCs w:val="34"/>
+              </w:rPr>
+              <w:t>Minimal React control</w:t>
+            </w:r>
+          </w:p>
+        </w:tc>
+      </w:tr>
+      <w:tr>
+        <w:trPr>
+          <w:tblCellSpacing w:w="15" w:type="dxa"/>
+        </w:trPr>
+        <w:tc>
+          <w:tcPr>
+            <w:tcW w:w="0" w:type="auto"/>
+            <w:vAlign w:val="center"/>
+            <w:hideMark/>
+          </w:tcPr>
+          <w:p>
+            <w:pPr>
+              <w:rPr>
+                <w:sz w:val="34"/>
+                <w:szCs w:val="34"/>
+              </w:rPr>
+            </w:pPr>
+            <w:r>
+              <w:rPr>
+                <w:sz w:val="34"/>
+                <w:szCs w:val="34"/>
+              </w:rPr>
+              <w:t>Use Case</w:t>
+            </w:r>
+          </w:p>
+        </w:tc>
+        <w:tc>
+          <w:tcPr>
+            <w:tcW w:w="0" w:type="auto"/>
+            <w:vAlign w:val="center"/>
+            <w:hideMark/>
+          </w:tcPr>
+          <w:p>
+            <w:pPr>
+              <w:rPr>
+                <w:sz w:val="34"/>
+                <w:szCs w:val="34"/>
+              </w:rPr>
+            </w:pPr>
+            <w:r>
+              <w:rPr>
+                <w:sz w:val="34"/>
+                <w:szCs w:val="34"/>
+              </w:rPr>
+              <w:t>Dynamic input validation, real-time UI</w:t>
+            </w:r>
+          </w:p>
+        </w:tc>
+        <w:tc>
+          <w:tcPr>
+            <w:tcW w:w="0" w:type="auto"/>
+            <w:vAlign w:val="center"/>
+            <w:hideMark/>
+          </w:tcPr>
+          <w:p>
+            <w:pPr>
+              <w:rPr>
+                <w:sz w:val="34"/>
+                <w:szCs w:val="34"/>
+              </w:rPr>
+            </w:pPr>
+            <w:r>
+              <w:rPr>
+                <w:sz w:val="34"/>
+                <w:szCs w:val="34"/>
+              </w:rPr>
+              <w:t>Simple or third-party libraries</w:t>
+            </w:r>
+          </w:p>
+        </w:tc>
+      </w:tr>
+    </w:tbl>
     <w:p>
       <w:pPr>
-        <w:pStyle w:val="HTMLPreformatted"/>
-        <w:rPr>
-          <w:rStyle w:val="HTMLCode"/>
-        </w:rPr>
-      </w:pPr>
-      <w:r>
-        <w:rPr>
-          <w:rStyle w:val="HTMLCode"/>
-        </w:rPr>
-        <w:t>let count = 5;</w:t>
-      </w:r>
-    </w:p>
-    <w:p>
-      <w:pPr>
-        <w:pStyle w:val="HTMLPreformatted"/>
-        <w:rPr>
-          <w:rStyle w:val="HTMLCode"/>
-        </w:rPr>
-      </w:pPr>
-      <w:r>
-        <w:rPr>
-          <w:rStyle w:val="HTMLCode"/>
-        </w:rPr>
-        <w:t>count = 10; /</w:t>
-      </w:r>
-      <w:proofErr w:type="gramStart"/>
-      <w:r>
-        <w:rPr>
-          <w:rStyle w:val="HTMLCode"/>
-        </w:rPr>
-        <w:t>/  allowed</w:t>
-      </w:r>
-      <w:proofErr w:type="gramEnd"/>
-    </w:p>
-    <w:p>
-      <w:pPr>
-        <w:pStyle w:val="Heading3"/>
-      </w:pPr>
-      <w:r>
-        <w:rPr>
-          <w:rFonts w:ascii="Segoe UI Emoji" w:hAnsi="Segoe UI Emoji" w:cs="Segoe UI Emoji"/>
-        </w:rPr>
-        <w:t>🔸</w:t>
-      </w:r>
-      <w:r>
-        <w:t xml:space="preserve"> </w:t>
-      </w:r>
-      <w:r>
-        <w:rPr>
-          <w:rStyle w:val="HTMLCode"/>
-        </w:rPr>
-        <w:t>const</w:t>
-      </w:r>
-      <w:r>
-        <w:t xml:space="preserve"> (Constant Variable)</w:t>
-      </w:r>
-    </w:p>
-    <w:p>
-      <w:pPr>
-        <w:pStyle w:val="NormalWeb"/>
-        <w:numPr>
-          <w:ilvl w:val="0"/>
-          <w:numId w:val="28"/>
-        </w:numPr>
-      </w:pPr>
-      <w:r>
-        <w:t>Introduced in ES6</w:t>
-      </w:r>
-    </w:p>
-    <w:p>
-      <w:pPr>
-        <w:pStyle w:val="NormalWeb"/>
-        <w:numPr>
-          <w:ilvl w:val="0"/>
-          <w:numId w:val="28"/>
-        </w:numPr>
-      </w:pPr>
-      <w:r>
-        <w:rPr>
-          <w:rStyle w:val="Strong"/>
-        </w:rPr>
-        <w:t>Block-scoped</w:t>
-      </w:r>
-    </w:p>
-    <w:p>
-      <w:pPr>
-        <w:pStyle w:val="NormalWeb"/>
-        <w:numPr>
-          <w:ilvl w:val="0"/>
-          <w:numId w:val="28"/>
-        </w:numPr>
-      </w:pPr>
-      <w:r>
-        <w:t xml:space="preserve">Cannot be </w:t>
-      </w:r>
-      <w:r>
-        <w:rPr>
-          <w:rStyle w:val="Strong"/>
-        </w:rPr>
-        <w:t>redeclared</w:t>
-      </w:r>
-      <w:r>
-        <w:t xml:space="preserve"> or </w:t>
-      </w:r>
-      <w:r>
-        <w:rPr>
-          <w:rStyle w:val="Strong"/>
-        </w:rPr>
-        <w:t>reassigned</w:t>
-      </w:r>
-    </w:p>
-    <w:p>
-      <w:pPr>
-        <w:pStyle w:val="NormalWeb"/>
-        <w:numPr>
-          <w:ilvl w:val="0"/>
-          <w:numId w:val="28"/>
-        </w:numPr>
-      </w:pPr>
-      <w:r>
-        <w:t xml:space="preserve">Use when value </w:t>
-      </w:r>
-      <w:r>
-        <w:rPr>
-          <w:rStyle w:val="Strong"/>
-        </w:rPr>
-        <w:t>should not change</w:t>
-      </w:r>
-    </w:p>
-    <w:p>
-      <w:pPr>
-        <w:pStyle w:val="HTMLPreformatted"/>
-        <w:rPr>
-          <w:rStyle w:val="HTMLCode"/>
-        </w:rPr>
-      </w:pPr>
-      <w:r>
-        <w:rPr>
-          <w:rStyle w:val="HTMLCode"/>
-        </w:rPr>
-        <w:t>const PI = 3.14;</w:t>
-      </w:r>
-    </w:p>
-    <w:p>
-      <w:pPr>
-        <w:pStyle w:val="HTMLPreformatted"/>
-        <w:rPr>
-          <w:rStyle w:val="HTMLCode"/>
-        </w:rPr>
-      </w:pPr>
-      <w:r>
-        <w:rPr>
-          <w:rStyle w:val="HTMLCode"/>
-        </w:rPr>
-        <w:t xml:space="preserve">// PI = </w:t>
-      </w:r>
-      <w:proofErr w:type="gramStart"/>
-      <w:r>
-        <w:rPr>
-          <w:rStyle w:val="HTMLCode"/>
-        </w:rPr>
-        <w:t xml:space="preserve">3.15 </w:t>
-      </w:r>
-      <w:r>
-        <w:rPr>
-          <w:rStyle w:val="HTMLCode"/>
-          <w:rFonts w:ascii="Segoe UI Emoji" w:hAnsi="Segoe UI Emoji" w:cs="Segoe UI Emoji"/>
-        </w:rPr>
-        <w:t>❌</w:t>
-      </w:r>
-      <w:r>
-        <w:rPr>
-          <w:rStyle w:val="HTMLCode"/>
-        </w:rPr>
-        <w:t xml:space="preserve"> Error</w:t>
-      </w:r>
-      <w:proofErr w:type="gramEnd"/>
-    </w:p>
-    <w:p>
-      <w:pPr>
-        <w:pStyle w:val="Heading4"/>
-      </w:pPr>
-      <w:r>
-        <w:t xml:space="preserve"> Use Case:</w:t>
-      </w:r>
-    </w:p>
-    <w:p>
-      <w:pPr>
-        <w:pStyle w:val="HTMLPreformatted"/>
-        <w:rPr>
-          <w:rStyle w:val="HTMLCode"/>
-        </w:rPr>
-      </w:pPr>
-      <w:r>
-        <w:rPr>
-          <w:rStyle w:val="HTMLCode"/>
-        </w:rPr>
-        <w:t xml:space="preserve">const </w:t>
-      </w:r>
-      <w:proofErr w:type="spellStart"/>
-      <w:r>
-        <w:rPr>
-          <w:rStyle w:val="HTMLCode"/>
-        </w:rPr>
-        <w:t>userName</w:t>
-      </w:r>
-      <w:proofErr w:type="spellEnd"/>
-      <w:r>
-        <w:rPr>
-          <w:rStyle w:val="HTMLCode"/>
-        </w:rPr>
-        <w:t xml:space="preserve"> = "Zain"; // Fixed name</w:t>
-      </w:r>
-    </w:p>
-    <w:p>
-      <w:pPr>
-        <w:pStyle w:val="HTMLPreformatted"/>
-        <w:rPr>
-          <w:rStyle w:val="HTMLCode"/>
-        </w:rPr>
-      </w:pPr>
-      <w:r>
-        <w:rPr>
-          <w:rStyle w:val="HTMLCode"/>
-        </w:rPr>
-        <w:t>let score = 0; // Score changes over time</w:t>
-      </w:r>
-    </w:p>
-    <w:p>
-      <w:r>
-        <w:pict w14:anchorId="1B18A63A">
-          <v:rect id="_x0000_i1043" style="width:0;height:1.5pt" o:hralign="center" o:hrstd="t" o:hr="t" fillcolor="#a0a0a0" stroked="f"/>
-        </w:pict>
-      </w:r>
-    </w:p>
-    <w:p>
-      <w:pPr>
-        <w:pStyle w:val="Heading2"/>
-      </w:pPr>
-      <w:r>
-        <w:rPr>
-          <w:rFonts w:ascii="Segoe UI Emoji" w:hAnsi="Segoe UI Emoji" w:cs="Segoe UI Emoji"/>
-        </w:rPr>
-        <w:lastRenderedPageBreak/>
-        <w:t>🔹</w:t>
-      </w:r>
-      <w:r>
-        <w:t xml:space="preserve"> 2. Arrow Functions (</w:t>
-      </w:r>
-      <w:r>
-        <w:rPr>
-          <w:rFonts w:ascii="Segoe UI Symbol" w:hAnsi="Segoe UI Symbol" w:cs="Segoe UI Symbol"/>
-        </w:rPr>
-        <w:t>➤</w:t>
-      </w:r>
-      <w:r>
-        <w:t xml:space="preserve"> </w:t>
-      </w:r>
-      <w:proofErr w:type="gramStart"/>
-      <w:r>
-        <w:rPr>
-          <w:rStyle w:val="HTMLCode"/>
-          <w:rFonts w:eastAsiaTheme="majorEastAsia"/>
-        </w:rPr>
-        <w:t>()=</w:t>
-      </w:r>
-      <w:proofErr w:type="gramEnd"/>
-      <w:r>
-        <w:rPr>
-          <w:rStyle w:val="HTMLCode"/>
-          <w:rFonts w:eastAsiaTheme="majorEastAsia"/>
-        </w:rPr>
-        <w:t>&gt;{}</w:t>
-      </w:r>
-      <w:r>
-        <w:t>)</w:t>
-      </w:r>
-    </w:p>
-    <w:p>
-      <w:pPr>
-        <w:pStyle w:val="NormalWeb"/>
-      </w:pPr>
-      <w:r>
-        <w:t xml:space="preserve">Arrow functions are </w:t>
-      </w:r>
-      <w:r>
-        <w:rPr>
-          <w:rStyle w:val="Strong"/>
-        </w:rPr>
-        <w:t>shorthand</w:t>
-      </w:r>
-      <w:r>
-        <w:t xml:space="preserve"> versions of regular functions.</w:t>
-      </w:r>
-    </w:p>
-    <w:p>
-      <w:pPr>
-        <w:pStyle w:val="Heading3"/>
-      </w:pPr>
-      <w:r>
-        <w:rPr>
-          <w:rFonts w:ascii="Segoe UI Emoji" w:hAnsi="Segoe UI Emoji" w:cs="Segoe UI Emoji"/>
-        </w:rPr>
-        <w:t>🔸</w:t>
-      </w:r>
-      <w:r>
-        <w:t xml:space="preserve"> Syntax:</w:t>
-      </w:r>
-    </w:p>
-    <w:p>
-      <w:pPr>
-        <w:pStyle w:val="HTMLPreformatted"/>
-        <w:rPr>
-          <w:rStyle w:val="HTMLCode"/>
-        </w:rPr>
-      </w:pPr>
-      <w:r>
-        <w:rPr>
-          <w:rStyle w:val="HTMLCode"/>
-        </w:rPr>
-        <w:t>const greet = (name) =&gt; {</w:t>
-      </w:r>
-    </w:p>
-    <w:p>
-      <w:pPr>
-        <w:pStyle w:val="HTMLPreformatted"/>
-        <w:rPr>
-          <w:rStyle w:val="HTMLCode"/>
-        </w:rPr>
-      </w:pPr>
-      <w:r>
-        <w:rPr>
-          <w:rStyle w:val="HTMLCode"/>
-        </w:rPr>
-        <w:t xml:space="preserve">  return `Hello, ${name}`;</w:t>
-      </w:r>
-    </w:p>
-    <w:p>
-      <w:pPr>
-        <w:pStyle w:val="HTMLPreformatted"/>
-        <w:rPr>
-          <w:rStyle w:val="HTMLCode"/>
-        </w:rPr>
-      </w:pPr>
-      <w:r>
-        <w:rPr>
-          <w:rStyle w:val="HTMLCode"/>
-        </w:rPr>
-        <w:t>};</w:t>
-      </w:r>
-    </w:p>
-    <w:p>
-      <w:pPr>
-        <w:pStyle w:val="NormalWeb"/>
-      </w:pPr>
-      <w:r>
-        <w:t>If one line:</w:t>
-      </w:r>
-    </w:p>
-    <w:p>
-      <w:pPr>
-        <w:pStyle w:val="HTMLPreformatted"/>
-        <w:rPr>
-          <w:rStyle w:val="HTMLCode"/>
-        </w:rPr>
-      </w:pPr>
-      <w:r>
-        <w:rPr>
-          <w:rStyle w:val="HTMLCode"/>
-        </w:rPr>
-        <w:t>const greet = name =&gt; `Hello, ${name}`;</w:t>
-      </w:r>
-    </w:p>
-    <w:p>
-      <w:pPr>
-        <w:pStyle w:val="Heading3"/>
-      </w:pPr>
-      <w:r>
-        <w:t>Use Case:</w:t>
-      </w:r>
-    </w:p>
-    <w:p>
-      <w:pPr>
-        <w:pStyle w:val="HTMLPreformatted"/>
-        <w:rPr>
-          <w:rStyle w:val="HTMLCode"/>
-        </w:rPr>
-      </w:pPr>
-      <w:r>
-        <w:rPr>
-          <w:rStyle w:val="HTMLCode"/>
-        </w:rPr>
-        <w:t>let numbers = [1, 2, 3];</w:t>
-      </w:r>
-    </w:p>
-    <w:p>
-      <w:pPr>
-        <w:pStyle w:val="HTMLPreformatted"/>
-        <w:rPr>
-          <w:rStyle w:val="HTMLCode"/>
-        </w:rPr>
-      </w:pPr>
-      <w:r>
-        <w:rPr>
-          <w:rStyle w:val="HTMLCode"/>
-        </w:rPr>
-        <w:t xml:space="preserve">let squared = </w:t>
-      </w:r>
-      <w:proofErr w:type="spellStart"/>
-      <w:proofErr w:type="gramStart"/>
-      <w:r>
-        <w:rPr>
-          <w:rStyle w:val="HTMLCode"/>
-        </w:rPr>
-        <w:t>numbers.map</w:t>
-      </w:r>
-      <w:proofErr w:type="spellEnd"/>
-      <w:r>
-        <w:rPr>
-          <w:rStyle w:val="HTMLCode"/>
-        </w:rPr>
-        <w:t>(</w:t>
-      </w:r>
-      <w:proofErr w:type="gramEnd"/>
-      <w:r>
-        <w:rPr>
-          <w:rStyle w:val="HTMLCode"/>
-        </w:rPr>
-        <w:t xml:space="preserve">n =&gt; n * n); </w:t>
-      </w:r>
-    </w:p>
-    <w:p>
-      <w:pPr>
-        <w:pStyle w:val="HTMLPreformatted"/>
-        <w:rPr>
-          <w:rStyle w:val="HTMLCode"/>
-        </w:rPr>
-      </w:pPr>
-      <w:r>
-        <w:rPr>
-          <w:rStyle w:val="HTMLCode"/>
-        </w:rPr>
-        <w:t>// [1, 4, 9]</w:t>
-      </w:r>
-    </w:p>
-    <w:p>
-      <w:r>
-        <w:pict w14:anchorId="1BADD1DE">
-          <v:rect id="_x0000_i1044" style="width:0;height:1.5pt" o:hralign="center" o:hrstd="t" o:hr="t" fillcolor="#a0a0a0" stroked="f"/>
-        </w:pict>
-      </w:r>
-    </w:p>
-    <w:p>
-      <w:pPr>
-        <w:pStyle w:val="Heading2"/>
-      </w:pPr>
-      <w:r>
-        <w:rPr>
-          <w:rFonts w:ascii="Segoe UI Emoji" w:hAnsi="Segoe UI Emoji" w:cs="Segoe UI Emoji"/>
-        </w:rPr>
-        <w:t>🔹</w:t>
-      </w:r>
-      <w:r>
-        <w:t xml:space="preserve"> 3. Template Literals</w:t>
-      </w:r>
-    </w:p>
-    <w:p>
-      <w:pPr>
-        <w:pStyle w:val="NormalWeb"/>
-      </w:pPr>
-      <w:r>
-        <w:rPr>
-          <w:rStyle w:val="Strong"/>
-        </w:rPr>
-        <w:t>Template literals</w:t>
-      </w:r>
-      <w:r>
-        <w:t xml:space="preserve"> allow:</w:t>
-      </w:r>
-    </w:p>
-    <w:p>
-      <w:pPr>
-        <w:pStyle w:val="NormalWeb"/>
-        <w:numPr>
-          <w:ilvl w:val="0"/>
-          <w:numId w:val="30"/>
-        </w:numPr>
-      </w:pPr>
-      <w:r>
-        <w:t>Easier string interpolation</w:t>
-      </w:r>
-    </w:p>
-    <w:p>
-      <w:pPr>
-        <w:pStyle w:val="NormalWeb"/>
-        <w:numPr>
-          <w:ilvl w:val="0"/>
-          <w:numId w:val="30"/>
-        </w:numPr>
-      </w:pPr>
-      <w:r>
-        <w:t>Multi-line strings</w:t>
-      </w:r>
-    </w:p>
-    <w:p>
-      <w:pPr>
-        <w:pStyle w:val="NormalWeb"/>
-        <w:numPr>
-          <w:ilvl w:val="0"/>
-          <w:numId w:val="30"/>
-        </w:numPr>
-      </w:pPr>
-      <w:r>
-        <w:t>Embedding expressions</w:t>
-      </w:r>
-    </w:p>
-    <w:p>
-      <w:pPr>
-        <w:pStyle w:val="Heading3"/>
-      </w:pPr>
-      <w:r>
-        <w:rPr>
-          <w:rFonts w:ascii="Segoe UI Emoji" w:hAnsi="Segoe UI Emoji" w:cs="Segoe UI Emoji"/>
-        </w:rPr>
-        <w:t>🔸</w:t>
-      </w:r>
-      <w:r>
-        <w:t xml:space="preserve"> Syntax:</w:t>
-      </w:r>
-    </w:p>
-    <w:p>
-      <w:pPr>
-        <w:pStyle w:val="NormalWeb"/>
-      </w:pPr>
-      <w:r>
-        <w:t xml:space="preserve">Use </w:t>
-      </w:r>
-      <w:r>
-        <w:rPr>
-          <w:rStyle w:val="Strong"/>
-        </w:rPr>
-        <w:t>backticks</w:t>
-      </w:r>
-      <w:r>
-        <w:t xml:space="preserve"> </w:t>
-      </w:r>
-      <w:r>
-        <w:rPr>
-          <w:rStyle w:val="HTMLCode"/>
-        </w:rPr>
-        <w:t>`</w:t>
-      </w:r>
-      <w:r>
-        <w:t xml:space="preserve"> and </w:t>
-      </w:r>
-      <w:r>
-        <w:rPr>
-          <w:rStyle w:val="HTMLCode"/>
-        </w:rPr>
-        <w:t>${}</w:t>
-      </w:r>
-      <w:r>
-        <w:t xml:space="preserve"> for variables.</w:t>
-      </w:r>
-    </w:p>
-    <w:p>
-      <w:pPr>
-        <w:pStyle w:val="Heading3"/>
-      </w:pPr>
-      <w:r>
-        <w:rPr>
-          <w:rFonts w:ascii="Segoe UI Emoji" w:hAnsi="Segoe UI Emoji" w:cs="Segoe UI Emoji"/>
-        </w:rPr>
-        <w:t>🔸</w:t>
-      </w:r>
-      <w:r>
-        <w:t xml:space="preserve"> Example:</w:t>
-      </w:r>
-    </w:p>
-    <w:p>
-      <w:pPr>
-        <w:pStyle w:val="HTMLPreformatted"/>
-        <w:rPr>
-          <w:rStyle w:val="HTMLCode"/>
-        </w:rPr>
-      </w:pPr>
-      <w:r>
-        <w:rPr>
-          <w:rStyle w:val="HTMLCode"/>
-        </w:rPr>
-        <w:t>const name = "Zain";</w:t>
-      </w:r>
-    </w:p>
-    <w:p>
-      <w:pPr>
-        <w:pStyle w:val="HTMLPreformatted"/>
-        <w:rPr>
-          <w:rStyle w:val="HTMLCode"/>
-        </w:rPr>
-      </w:pPr>
-      <w:r>
-        <w:rPr>
-          <w:rStyle w:val="HTMLCode"/>
-        </w:rPr>
-        <w:t>const age = 22;</w:t>
-      </w:r>
-    </w:p>
-    <w:p>
-      <w:pPr>
-        <w:pStyle w:val="HTMLPreformatted"/>
-        <w:rPr>
-          <w:rStyle w:val="HTMLCode"/>
-        </w:rPr>
-      </w:pPr>
-    </w:p>
-    <w:p>
-      <w:pPr>
-        <w:pStyle w:val="HTMLPreformatted"/>
-        <w:rPr>
-          <w:rStyle w:val="HTMLCode"/>
-        </w:rPr>
-      </w:pPr>
-      <w:r>
-        <w:rPr>
-          <w:rStyle w:val="HTMLCode"/>
-        </w:rPr>
-        <w:t xml:space="preserve">const intro = `My name is ${name} and I am ${age} years </w:t>
-      </w:r>
-      <w:proofErr w:type="gramStart"/>
-      <w:r>
-        <w:rPr>
-          <w:rStyle w:val="HTMLCode"/>
-        </w:rPr>
-        <w:t>old.`</w:t>
-      </w:r>
-      <w:proofErr w:type="gramEnd"/>
-      <w:r>
-        <w:rPr>
-          <w:rStyle w:val="HTMLCode"/>
-        </w:rPr>
-        <w:t>;</w:t>
-      </w:r>
-    </w:p>
-    <w:p>
-      <w:pPr>
-        <w:pStyle w:val="HTMLPreformatted"/>
-        <w:rPr>
-          <w:rStyle w:val="HTMLCode"/>
-        </w:rPr>
-      </w:pPr>
-      <w:r>
-        <w:rPr>
-          <w:rStyle w:val="HTMLCode"/>
-        </w:rPr>
-        <w:t>console.log(intro);</w:t>
-      </w:r>
-    </w:p>
-    <w:p>
-      <w:pPr>
-        <w:pStyle w:val="Heading3"/>
-      </w:pPr>
-      <w:r>
-        <w:rPr>
-          <w:rFonts w:ascii="Segoe UI Emoji" w:hAnsi="Segoe UI Emoji" w:cs="Segoe UI Emoji"/>
-        </w:rPr>
-        <w:t>🔸</w:t>
-      </w:r>
-      <w:r>
-        <w:t xml:space="preserve"> Multi-line:</w:t>
-      </w:r>
-    </w:p>
-    <w:p>
-      <w:pPr>
-        <w:pStyle w:val="HTMLPreformatted"/>
-        <w:rPr>
-          <w:rStyle w:val="HTMLCode"/>
-        </w:rPr>
-      </w:pPr>
-      <w:r>
-        <w:rPr>
-          <w:rStyle w:val="HTMLCode"/>
-        </w:rPr>
-        <w:t>const message = `</w:t>
-      </w:r>
-    </w:p>
-    <w:p>
-      <w:pPr>
-        <w:pStyle w:val="HTMLPreformatted"/>
-        <w:rPr>
-          <w:rStyle w:val="HTMLCode"/>
-        </w:rPr>
-      </w:pPr>
-      <w:r>
-        <w:rPr>
-          <w:rStyle w:val="HTMLCode"/>
-        </w:rPr>
-        <w:t>Hello,</w:t>
-      </w:r>
-    </w:p>
-    <w:p>
-      <w:pPr>
-        <w:pStyle w:val="HTMLPreformatted"/>
-        <w:rPr>
-          <w:rStyle w:val="HTMLCode"/>
-        </w:rPr>
-      </w:pPr>
-      <w:r>
-        <w:rPr>
-          <w:rStyle w:val="HTMLCode"/>
-        </w:rPr>
-        <w:t>This is a multi-line</w:t>
-      </w:r>
-    </w:p>
-    <w:p>
-      <w:pPr>
-        <w:pStyle w:val="HTMLPreformatted"/>
-        <w:rPr>
-          <w:rStyle w:val="HTMLCode"/>
-        </w:rPr>
-      </w:pPr>
-      <w:r>
-        <w:rPr>
-          <w:rStyle w:val="HTMLCode"/>
-        </w:rPr>
-        <w:t>string in JavaScript.</w:t>
-      </w:r>
-    </w:p>
-    <w:p>
-      <w:pPr>
-        <w:pStyle w:val="HTMLPreformatted"/>
-        <w:rPr>
-          <w:rStyle w:val="HTMLCode"/>
-        </w:rPr>
-      </w:pPr>
-      <w:r>
-        <w:rPr>
-          <w:rStyle w:val="HTMLCode"/>
-        </w:rPr>
-        <w:t>`;</w:t>
-      </w:r>
-    </w:p>
-    <w:p>
-      <w:r>
-        <w:lastRenderedPageBreak/>
-        <w:pict w14:anchorId="76590078">
-          <v:rect id="_x0000_i1045" style="width:0;height:1.5pt" o:hralign="center" o:hrstd="t" o:hr="t" fillcolor="#a0a0a0" stroked="f"/>
-        </w:pict>
-      </w:r>
-    </w:p>
-    <w:p>
-      <w:pPr>
-        <w:pStyle w:val="Heading2"/>
-      </w:pPr>
-      <w:r>
-        <w:rPr>
-          <w:rFonts w:ascii="Segoe UI Emoji" w:hAnsi="Segoe UI Emoji" w:cs="Segoe UI Emoji"/>
-        </w:rPr>
-        <w:t>🔹</w:t>
-      </w:r>
-      <w:r>
-        <w:t xml:space="preserve"> 4. Real-Life Use Cases</w:t>
-      </w:r>
-    </w:p>
-    <w:p>
-      <w:pPr>
-        <w:pStyle w:val="Heading3"/>
-      </w:pPr>
-      <w:r>
-        <w:t xml:space="preserve"> Using All Together:</w:t>
-      </w:r>
-    </w:p>
-    <w:p>
-      <w:pPr>
-        <w:pStyle w:val="HTMLPreformatted"/>
-        <w:rPr>
-          <w:rStyle w:val="HTMLCode"/>
-        </w:rPr>
-      </w:pPr>
-      <w:r>
-        <w:rPr>
-          <w:rStyle w:val="HTMLCode"/>
-        </w:rPr>
-        <w:t>const user = "Zain";</w:t>
-      </w:r>
-    </w:p>
-    <w:p>
-      <w:pPr>
-        <w:pStyle w:val="HTMLPreformatted"/>
-        <w:rPr>
-          <w:rStyle w:val="HTMLCode"/>
-        </w:rPr>
-      </w:pPr>
-      <w:r>
-        <w:rPr>
-          <w:rStyle w:val="HTMLCode"/>
-        </w:rPr>
-        <w:t xml:space="preserve">let </w:t>
-      </w:r>
-      <w:proofErr w:type="spellStart"/>
-      <w:r>
-        <w:rPr>
-          <w:rStyle w:val="HTMLCode"/>
-        </w:rPr>
-        <w:t>taskCount</w:t>
-      </w:r>
-      <w:proofErr w:type="spellEnd"/>
-      <w:r>
-        <w:rPr>
-          <w:rStyle w:val="HTMLCode"/>
-        </w:rPr>
-        <w:t xml:space="preserve"> = 3;</w:t>
-      </w:r>
-    </w:p>
-    <w:p>
-      <w:pPr>
-        <w:pStyle w:val="HTMLPreformatted"/>
-        <w:rPr>
-          <w:rStyle w:val="HTMLCode"/>
-        </w:rPr>
-      </w:pPr>
-    </w:p>
-    <w:p>
-      <w:pPr>
-        <w:pStyle w:val="HTMLPreformatted"/>
-        <w:rPr>
-          <w:rStyle w:val="HTMLCode"/>
-        </w:rPr>
-      </w:pPr>
-      <w:r>
-        <w:rPr>
-          <w:rStyle w:val="HTMLCode"/>
-        </w:rPr>
-        <w:t xml:space="preserve">const </w:t>
-      </w:r>
-      <w:proofErr w:type="spellStart"/>
-      <w:r>
-        <w:rPr>
-          <w:rStyle w:val="HTMLCode"/>
-        </w:rPr>
-        <w:t>taskSummary</w:t>
-      </w:r>
-      <w:proofErr w:type="spellEnd"/>
-      <w:r>
-        <w:rPr>
-          <w:rStyle w:val="HTMLCode"/>
-        </w:rPr>
-        <w:t xml:space="preserve"> = (name, tasks) =&gt; {</w:t>
-      </w:r>
-    </w:p>
-    <w:p>
-      <w:pPr>
-        <w:pStyle w:val="HTMLPreformatted"/>
-        <w:rPr>
-          <w:rStyle w:val="HTMLCode"/>
-        </w:rPr>
-      </w:pPr>
-      <w:r>
-        <w:rPr>
-          <w:rStyle w:val="HTMLCode"/>
-        </w:rPr>
-        <w:t xml:space="preserve">  return `Hello ${name}, you have ${tasks} tasks to do </w:t>
-      </w:r>
-      <w:proofErr w:type="gramStart"/>
-      <w:r>
-        <w:rPr>
-          <w:rStyle w:val="HTMLCode"/>
-        </w:rPr>
-        <w:t>today.`</w:t>
-      </w:r>
-      <w:proofErr w:type="gramEnd"/>
-      <w:r>
-        <w:rPr>
-          <w:rStyle w:val="HTMLCode"/>
-        </w:rPr>
-        <w:t>;</w:t>
-      </w:r>
-    </w:p>
-    <w:p>
-      <w:pPr>
-        <w:pStyle w:val="HTMLPreformatted"/>
-        <w:rPr>
-          <w:rStyle w:val="HTMLCode"/>
-        </w:rPr>
-      </w:pPr>
-      <w:r>
-        <w:rPr>
-          <w:rStyle w:val="HTMLCode"/>
-        </w:rPr>
-        <w:t>};</w:t>
-      </w:r>
-    </w:p>
-    <w:p>
-      <w:pPr>
-        <w:pStyle w:val="HTMLPreformatted"/>
-        <w:rPr>
-          <w:rStyle w:val="HTMLCode"/>
-        </w:rPr>
-      </w:pPr>
-    </w:p>
-    <w:p>
-      <w:pPr>
-        <w:pStyle w:val="HTMLPreformatted"/>
-        <w:rPr>
-          <w:rStyle w:val="HTMLCode"/>
-        </w:rPr>
-      </w:pPr>
-      <w:proofErr w:type="gramStart"/>
-      <w:r>
-        <w:rPr>
-          <w:rStyle w:val="HTMLCode"/>
-        </w:rPr>
-        <w:t>console.log(</w:t>
-      </w:r>
-      <w:proofErr w:type="spellStart"/>
-      <w:proofErr w:type="gramEnd"/>
-      <w:r>
-        <w:rPr>
-          <w:rStyle w:val="HTMLCode"/>
-        </w:rPr>
-        <w:t>taskSummary</w:t>
-      </w:r>
-      <w:proofErr w:type="spellEnd"/>
-      <w:r>
-        <w:rPr>
-          <w:rStyle w:val="HTMLCode"/>
-        </w:rPr>
-        <w:t xml:space="preserve">(user, </w:t>
-      </w:r>
-      <w:proofErr w:type="spellStart"/>
-      <w:r>
-        <w:rPr>
-          <w:rStyle w:val="HTMLCode"/>
-        </w:rPr>
-        <w:t>taskCount</w:t>
-      </w:r>
-      <w:proofErr w:type="spellEnd"/>
-      <w:r>
-        <w:rPr>
-          <w:rStyle w:val="HTMLCode"/>
-        </w:rPr>
-        <w:t>));</w:t>
-      </w:r>
-    </w:p>
-    <w:p/>
-    <w:p>
-      <w:pPr>
-        <w:pStyle w:val="Heading2"/>
-      </w:pPr>
-      <w:r>
-        <w:t xml:space="preserve"> What I’ve Learned</w:t>
-      </w:r>
-    </w:p>
-    <w:p>
-      <w:pPr>
-        <w:pStyle w:val="NormalWeb"/>
-        <w:numPr>
-          <w:ilvl w:val="0"/>
-          <w:numId w:val="32"/>
-        </w:numPr>
-      </w:pPr>
-      <w:r>
-        <w:t>ES6+ provides cleaner and modern ways to write JavaScript</w:t>
-      </w:r>
-    </w:p>
-    <w:p>
-      <w:pPr>
-        <w:pStyle w:val="NormalWeb"/>
-        <w:numPr>
-          <w:ilvl w:val="0"/>
-          <w:numId w:val="32"/>
-        </w:numPr>
-      </w:pPr>
-      <w:r>
-        <w:rPr>
-          <w:rStyle w:val="HTMLCode"/>
-        </w:rPr>
-        <w:t>let</w:t>
-      </w:r>
-      <w:r>
-        <w:t xml:space="preserve"> and </w:t>
-      </w:r>
-      <w:r>
-        <w:rPr>
-          <w:rStyle w:val="HTMLCode"/>
-        </w:rPr>
-        <w:t>const</w:t>
-      </w:r>
-      <w:r>
-        <w:t xml:space="preserve"> should replace </w:t>
-      </w:r>
-      <w:r>
-        <w:rPr>
-          <w:rStyle w:val="HTMLCode"/>
-        </w:rPr>
-        <w:t>var</w:t>
-      </w:r>
-      <w:r>
-        <w:t xml:space="preserve"> for better scoping</w:t>
-      </w:r>
-    </w:p>
-    <w:p>
-      <w:pPr>
-        <w:pStyle w:val="NormalWeb"/>
-        <w:numPr>
-          <w:ilvl w:val="0"/>
-          <w:numId w:val="32"/>
-        </w:numPr>
-      </w:pPr>
-      <w:r>
-        <w:t>Arrow functions simplify function syntax</w:t>
-      </w:r>
-    </w:p>
-    <w:p>
-      <w:pPr>
-        <w:pStyle w:val="NormalWeb"/>
-        <w:numPr>
-          <w:ilvl w:val="0"/>
-          <w:numId w:val="32"/>
-        </w:numPr>
-      </w:pPr>
-      <w:r>
-        <w:t>Template literals make strings easier to handle</w:t>
-      </w:r>
-    </w:p>
-    <w:p/>
-    <w:p>
-      <w:pPr>
-        <w:pStyle w:val="NormalWeb"/>
+        <w:pStyle w:val="Heading1"/>
       </w:pPr>
     </w:p>
     <w:sectPr>
@@ -1852,6 +2646,155 @@
 <file path=word/numbering.xml><?xml version="1.0" encoding="utf-8"?>
 <w:numbering xmlns:wpc="http://schemas.microsoft.com/office/word/2010/wordprocessingCanvas" xmlns:cx="http://schemas.microsoft.com/office/drawing/2014/chartex" xmlns:cx1="http://schemas.microsoft.com/office/drawing/2015/9/8/chartex" xmlns:cx2="http://schemas.microsoft.com/office/drawing/2015/10/21/chartex" xmlns:cx3="http://schemas.microsoft.com/office/drawing/2016/5/9/chartex" xmlns:cx4="http://schemas.microsoft.com/office/drawing/2016/5/10/chartex" xmlns:cx5="http://schemas.microsoft.com/office/drawing/2016/5/11/chartex" xmlns:cx6="http://schemas.microsoft.com/office/drawing/2016/5/12/chartex" xmlns:cx7="http://schemas.microsoft.com/office/drawing/2016/5/13/chartex" xmlns:cx8="http://schemas.microsoft.com/office/drawing/2016/5/14/chartex" xmlns:mc="http://schemas.openxmlformats.org/markup-compatibility/2006" xmlns:aink="http://schemas.microsoft.com/office/drawing/2016/ink" xmlns:am3d="http://schemas.microsoft.com/office/drawing/2017/model3d" xmlns:o="urn:schemas-microsoft-com:office:office" xmlns:r="http://schemas.openxmlformats.org/officeDocument/2006/relationships" xmlns:m="http://schemas.openxmlformats.org/officeDocument/2006/math" xmlns:v="urn:schemas-microsoft-com:vml" xmlns:wp14="http://schemas.microsoft.com/office/word/2010/wordprocessingDrawing" xmlns:wp="http://schemas.openxmlformats.org/drawingml/2006/wordprocessingDrawing" xmlns:w10="urn:schemas-microsoft-com:office:word" xmlns:w="http://schemas.openxmlformats.org/wordprocessingml/2006/main" xmlns:w14="http://schemas.microsoft.com/office/word/2010/wordml" xmlns:w15="http://schemas.microsoft.com/office/word/2012/wordml" xmlns:w16cid="http://schemas.microsoft.com/office/word/2016/wordml/cid" xmlns:w16se="http://schemas.microsoft.com/office/word/2015/wordml/symex" xmlns:wpg="http://schemas.microsoft.com/office/word/2010/wordprocessingGroup" xmlns:wpi="http://schemas.microsoft.com/office/word/2010/wordprocessingInk" xmlns:wne="http://schemas.microsoft.com/office/word/2006/wordml" xmlns:wps="http://schemas.microsoft.com/office/word/2010/wordprocessingShape" mc:Ignorable="w14 w15 w16se w16cid wp14">
   <w:abstractNum w:abstractNumId="0" w15:restartNumberingAfterBreak="0">
+    <w:nsid w:val="074210E8"/>
+    <w:multiLevelType w:val="multilevel"/>
+    <w:tmpl w:val="90129510"/>
+    <w:lvl w:ilvl="0">
+      <w:start w:val="1"/>
+      <w:numFmt w:val="bullet"/>
+      <w:lvlText w:val=""/>
+      <w:lvlJc w:val="left"/>
+      <w:pPr>
+        <w:tabs>
+          <w:tab w:val="num" w:pos="720"/>
+        </w:tabs>
+        <w:ind w:left="720" w:hanging="360"/>
+      </w:pPr>
+      <w:rPr>
+        <w:rFonts w:ascii="Symbol" w:hAnsi="Symbol" w:hint="default"/>
+        <w:sz w:val="20"/>
+      </w:rPr>
+    </w:lvl>
+    <w:lvl w:ilvl="1" w:tentative="1">
+      <w:start w:val="1"/>
+      <w:numFmt w:val="bullet"/>
+      <w:lvlText w:val="o"/>
+      <w:lvlJc w:val="left"/>
+      <w:pPr>
+        <w:tabs>
+          <w:tab w:val="num" w:pos="1440"/>
+        </w:tabs>
+        <w:ind w:left="1440" w:hanging="360"/>
+      </w:pPr>
+      <w:rPr>
+        <w:rFonts w:ascii="Courier New" w:hAnsi="Courier New" w:hint="default"/>
+        <w:sz w:val="20"/>
+      </w:rPr>
+    </w:lvl>
+    <w:lvl w:ilvl="2" w:tentative="1">
+      <w:start w:val="1"/>
+      <w:numFmt w:val="bullet"/>
+      <w:lvlText w:val=""/>
+      <w:lvlJc w:val="left"/>
+      <w:pPr>
+        <w:tabs>
+          <w:tab w:val="num" w:pos="2160"/>
+        </w:tabs>
+        <w:ind w:left="2160" w:hanging="360"/>
+      </w:pPr>
+      <w:rPr>
+        <w:rFonts w:ascii="Wingdings" w:hAnsi="Wingdings" w:hint="default"/>
+        <w:sz w:val="20"/>
+      </w:rPr>
+    </w:lvl>
+    <w:lvl w:ilvl="3" w:tentative="1">
+      <w:start w:val="1"/>
+      <w:numFmt w:val="bullet"/>
+      <w:lvlText w:val=""/>
+      <w:lvlJc w:val="left"/>
+      <w:pPr>
+        <w:tabs>
+          <w:tab w:val="num" w:pos="2880"/>
+        </w:tabs>
+        <w:ind w:left="2880" w:hanging="360"/>
+      </w:pPr>
+      <w:rPr>
+        <w:rFonts w:ascii="Wingdings" w:hAnsi="Wingdings" w:hint="default"/>
+        <w:sz w:val="20"/>
+      </w:rPr>
+    </w:lvl>
+    <w:lvl w:ilvl="4" w:tentative="1">
+      <w:start w:val="1"/>
+      <w:numFmt w:val="bullet"/>
+      <w:lvlText w:val=""/>
+      <w:lvlJc w:val="left"/>
+      <w:pPr>
+        <w:tabs>
+          <w:tab w:val="num" w:pos="3600"/>
+        </w:tabs>
+        <w:ind w:left="3600" w:hanging="360"/>
+      </w:pPr>
+      <w:rPr>
+        <w:rFonts w:ascii="Wingdings" w:hAnsi="Wingdings" w:hint="default"/>
+        <w:sz w:val="20"/>
+      </w:rPr>
+    </w:lvl>
+    <w:lvl w:ilvl="5" w:tentative="1">
+      <w:start w:val="1"/>
+      <w:numFmt w:val="bullet"/>
+      <w:lvlText w:val=""/>
+      <w:lvlJc w:val="left"/>
+      <w:pPr>
+        <w:tabs>
+          <w:tab w:val="num" w:pos="4320"/>
+        </w:tabs>
+        <w:ind w:left="4320" w:hanging="360"/>
+      </w:pPr>
+      <w:rPr>
+        <w:rFonts w:ascii="Wingdings" w:hAnsi="Wingdings" w:hint="default"/>
+        <w:sz w:val="20"/>
+      </w:rPr>
+    </w:lvl>
+    <w:lvl w:ilvl="6" w:tentative="1">
+      <w:start w:val="1"/>
+      <w:numFmt w:val="bullet"/>
+      <w:lvlText w:val=""/>
+      <w:lvlJc w:val="left"/>
+      <w:pPr>
+        <w:tabs>
+          <w:tab w:val="num" w:pos="5040"/>
+        </w:tabs>
+        <w:ind w:left="5040" w:hanging="360"/>
+      </w:pPr>
+      <w:rPr>
+        <w:rFonts w:ascii="Wingdings" w:hAnsi="Wingdings" w:hint="default"/>
+        <w:sz w:val="20"/>
+      </w:rPr>
+    </w:lvl>
+    <w:lvl w:ilvl="7" w:tentative="1">
+      <w:start w:val="1"/>
+      <w:numFmt w:val="bullet"/>
+      <w:lvlText w:val=""/>
+      <w:lvlJc w:val="left"/>
+      <w:pPr>
+        <w:tabs>
+          <w:tab w:val="num" w:pos="5760"/>
+        </w:tabs>
+        <w:ind w:left="5760" w:hanging="360"/>
+      </w:pPr>
+      <w:rPr>
+        <w:rFonts w:ascii="Wingdings" w:hAnsi="Wingdings" w:hint="default"/>
+        <w:sz w:val="20"/>
+      </w:rPr>
+    </w:lvl>
+    <w:lvl w:ilvl="8" w:tentative="1">
+      <w:start w:val="1"/>
+      <w:numFmt w:val="bullet"/>
+      <w:lvlText w:val=""/>
+      <w:lvlJc w:val="left"/>
+      <w:pPr>
+        <w:tabs>
+          <w:tab w:val="num" w:pos="6480"/>
+        </w:tabs>
+        <w:ind w:left="6480" w:hanging="360"/>
+      </w:pPr>
+      <w:rPr>
+        <w:rFonts w:ascii="Wingdings" w:hAnsi="Wingdings" w:hint="default"/>
+        <w:sz w:val="20"/>
+      </w:rPr>
+    </w:lvl>
+  </w:abstractNum>
+  <w:abstractNum w:abstractNumId="1" w15:restartNumberingAfterBreak="0">
     <w:nsid w:val="080019B5"/>
     <w:multiLevelType w:val="multilevel"/>
     <w:tmpl w:val="F81E2AE6"/>
@@ -2000,7 +2943,7 @@
       </w:rPr>
     </w:lvl>
   </w:abstractNum>
-  <w:abstractNum w:abstractNumId="1" w15:restartNumberingAfterBreak="0">
+  <w:abstractNum w:abstractNumId="2" w15:restartNumberingAfterBreak="0">
     <w:nsid w:val="081B1660"/>
     <w:multiLevelType w:val="multilevel"/>
     <w:tmpl w:val="1364570E"/>
@@ -2149,7 +3092,156 @@
       </w:rPr>
     </w:lvl>
   </w:abstractNum>
-  <w:abstractNum w:abstractNumId="2" w15:restartNumberingAfterBreak="0">
+  <w:abstractNum w:abstractNumId="3" w15:restartNumberingAfterBreak="0">
+    <w:nsid w:val="141D5702"/>
+    <w:multiLevelType w:val="multilevel"/>
+    <w:tmpl w:val="81F88C6C"/>
+    <w:lvl w:ilvl="0">
+      <w:start w:val="1"/>
+      <w:numFmt w:val="bullet"/>
+      <w:lvlText w:val=""/>
+      <w:lvlJc w:val="left"/>
+      <w:pPr>
+        <w:tabs>
+          <w:tab w:val="num" w:pos="720"/>
+        </w:tabs>
+        <w:ind w:left="720" w:hanging="360"/>
+      </w:pPr>
+      <w:rPr>
+        <w:rFonts w:ascii="Symbol" w:hAnsi="Symbol" w:hint="default"/>
+        <w:sz w:val="20"/>
+      </w:rPr>
+    </w:lvl>
+    <w:lvl w:ilvl="1" w:tentative="1">
+      <w:start w:val="1"/>
+      <w:numFmt w:val="bullet"/>
+      <w:lvlText w:val="o"/>
+      <w:lvlJc w:val="left"/>
+      <w:pPr>
+        <w:tabs>
+          <w:tab w:val="num" w:pos="1440"/>
+        </w:tabs>
+        <w:ind w:left="1440" w:hanging="360"/>
+      </w:pPr>
+      <w:rPr>
+        <w:rFonts w:ascii="Courier New" w:hAnsi="Courier New" w:hint="default"/>
+        <w:sz w:val="20"/>
+      </w:rPr>
+    </w:lvl>
+    <w:lvl w:ilvl="2" w:tentative="1">
+      <w:start w:val="1"/>
+      <w:numFmt w:val="bullet"/>
+      <w:lvlText w:val=""/>
+      <w:lvlJc w:val="left"/>
+      <w:pPr>
+        <w:tabs>
+          <w:tab w:val="num" w:pos="2160"/>
+        </w:tabs>
+        <w:ind w:left="2160" w:hanging="360"/>
+      </w:pPr>
+      <w:rPr>
+        <w:rFonts w:ascii="Wingdings" w:hAnsi="Wingdings" w:hint="default"/>
+        <w:sz w:val="20"/>
+      </w:rPr>
+    </w:lvl>
+    <w:lvl w:ilvl="3" w:tentative="1">
+      <w:start w:val="1"/>
+      <w:numFmt w:val="bullet"/>
+      <w:lvlText w:val=""/>
+      <w:lvlJc w:val="left"/>
+      <w:pPr>
+        <w:tabs>
+          <w:tab w:val="num" w:pos="2880"/>
+        </w:tabs>
+        <w:ind w:left="2880" w:hanging="360"/>
+      </w:pPr>
+      <w:rPr>
+        <w:rFonts w:ascii="Wingdings" w:hAnsi="Wingdings" w:hint="default"/>
+        <w:sz w:val="20"/>
+      </w:rPr>
+    </w:lvl>
+    <w:lvl w:ilvl="4" w:tentative="1">
+      <w:start w:val="1"/>
+      <w:numFmt w:val="bullet"/>
+      <w:lvlText w:val=""/>
+      <w:lvlJc w:val="left"/>
+      <w:pPr>
+        <w:tabs>
+          <w:tab w:val="num" w:pos="3600"/>
+        </w:tabs>
+        <w:ind w:left="3600" w:hanging="360"/>
+      </w:pPr>
+      <w:rPr>
+        <w:rFonts w:ascii="Wingdings" w:hAnsi="Wingdings" w:hint="default"/>
+        <w:sz w:val="20"/>
+      </w:rPr>
+    </w:lvl>
+    <w:lvl w:ilvl="5" w:tentative="1">
+      <w:start w:val="1"/>
+      <w:numFmt w:val="bullet"/>
+      <w:lvlText w:val=""/>
+      <w:lvlJc w:val="left"/>
+      <w:pPr>
+        <w:tabs>
+          <w:tab w:val="num" w:pos="4320"/>
+        </w:tabs>
+        <w:ind w:left="4320" w:hanging="360"/>
+      </w:pPr>
+      <w:rPr>
+        <w:rFonts w:ascii="Wingdings" w:hAnsi="Wingdings" w:hint="default"/>
+        <w:sz w:val="20"/>
+      </w:rPr>
+    </w:lvl>
+    <w:lvl w:ilvl="6" w:tentative="1">
+      <w:start w:val="1"/>
+      <w:numFmt w:val="bullet"/>
+      <w:lvlText w:val=""/>
+      <w:lvlJc w:val="left"/>
+      <w:pPr>
+        <w:tabs>
+          <w:tab w:val="num" w:pos="5040"/>
+        </w:tabs>
+        <w:ind w:left="5040" w:hanging="360"/>
+      </w:pPr>
+      <w:rPr>
+        <w:rFonts w:ascii="Wingdings" w:hAnsi="Wingdings" w:hint="default"/>
+        <w:sz w:val="20"/>
+      </w:rPr>
+    </w:lvl>
+    <w:lvl w:ilvl="7" w:tentative="1">
+      <w:start w:val="1"/>
+      <w:numFmt w:val="bullet"/>
+      <w:lvlText w:val=""/>
+      <w:lvlJc w:val="left"/>
+      <w:pPr>
+        <w:tabs>
+          <w:tab w:val="num" w:pos="5760"/>
+        </w:tabs>
+        <w:ind w:left="5760" w:hanging="360"/>
+      </w:pPr>
+      <w:rPr>
+        <w:rFonts w:ascii="Wingdings" w:hAnsi="Wingdings" w:hint="default"/>
+        <w:sz w:val="20"/>
+      </w:rPr>
+    </w:lvl>
+    <w:lvl w:ilvl="8" w:tentative="1">
+      <w:start w:val="1"/>
+      <w:numFmt w:val="bullet"/>
+      <w:lvlText w:val=""/>
+      <w:lvlJc w:val="left"/>
+      <w:pPr>
+        <w:tabs>
+          <w:tab w:val="num" w:pos="6480"/>
+        </w:tabs>
+        <w:ind w:left="6480" w:hanging="360"/>
+      </w:pPr>
+      <w:rPr>
+        <w:rFonts w:ascii="Wingdings" w:hAnsi="Wingdings" w:hint="default"/>
+        <w:sz w:val="20"/>
+      </w:rPr>
+    </w:lvl>
+  </w:abstractNum>
+  <w:abstractNum w:abstractNumId="4" w15:restartNumberingAfterBreak="0">
     <w:nsid w:val="14A36D37"/>
     <w:multiLevelType w:val="multilevel"/>
     <w:tmpl w:val="620E3686"/>
@@ -2298,7 +3390,7 @@
       </w:rPr>
     </w:lvl>
   </w:abstractNum>
-  <w:abstractNum w:abstractNumId="3" w15:restartNumberingAfterBreak="0">
+  <w:abstractNum w:abstractNumId="5" w15:restartNumberingAfterBreak="0">
     <w:nsid w:val="14CF0D9B"/>
     <w:multiLevelType w:val="multilevel"/>
     <w:tmpl w:val="2CF2A6C2"/>
@@ -2447,7 +3539,7 @@
       </w:rPr>
     </w:lvl>
   </w:abstractNum>
-  <w:abstractNum w:abstractNumId="4" w15:restartNumberingAfterBreak="0">
+  <w:abstractNum w:abstractNumId="6" w15:restartNumberingAfterBreak="0">
     <w:nsid w:val="156E59D7"/>
     <w:multiLevelType w:val="multilevel"/>
     <w:tmpl w:val="8DCEACAE"/>
@@ -2596,7 +3688,7 @@
       </w:rPr>
     </w:lvl>
   </w:abstractNum>
-  <w:abstractNum w:abstractNumId="5" w15:restartNumberingAfterBreak="0">
+  <w:abstractNum w:abstractNumId="7" w15:restartNumberingAfterBreak="0">
     <w:nsid w:val="1C603DD1"/>
     <w:multiLevelType w:val="multilevel"/>
     <w:tmpl w:val="71042C6C"/>
@@ -2745,7 +3837,7 @@
       </w:rPr>
     </w:lvl>
   </w:abstractNum>
-  <w:abstractNum w:abstractNumId="6" w15:restartNumberingAfterBreak="0">
+  <w:abstractNum w:abstractNumId="8" w15:restartNumberingAfterBreak="0">
     <w:nsid w:val="1F1E773D"/>
     <w:multiLevelType w:val="multilevel"/>
     <w:tmpl w:val="87F685AC"/>
@@ -2894,7 +3986,7 @@
       </w:rPr>
     </w:lvl>
   </w:abstractNum>
-  <w:abstractNum w:abstractNumId="7" w15:restartNumberingAfterBreak="0">
+  <w:abstractNum w:abstractNumId="9" w15:restartNumberingAfterBreak="0">
     <w:nsid w:val="207D008E"/>
     <w:multiLevelType w:val="multilevel"/>
     <w:tmpl w:val="F3D282D6"/>
@@ -3007,7 +4099,7 @@
       </w:pPr>
     </w:lvl>
   </w:abstractNum>
-  <w:abstractNum w:abstractNumId="8" w15:restartNumberingAfterBreak="0">
+  <w:abstractNum w:abstractNumId="10" w15:restartNumberingAfterBreak="0">
     <w:nsid w:val="20836E56"/>
     <w:multiLevelType w:val="hybridMultilevel"/>
     <w:tmpl w:val="BB0C3CB8"/>
@@ -3096,7 +4188,7 @@
       </w:pPr>
     </w:lvl>
   </w:abstractNum>
-  <w:abstractNum w:abstractNumId="9" w15:restartNumberingAfterBreak="0">
+  <w:abstractNum w:abstractNumId="11" w15:restartNumberingAfterBreak="0">
     <w:nsid w:val="253068CD"/>
     <w:multiLevelType w:val="multilevel"/>
     <w:tmpl w:val="7A6E6E62"/>
@@ -3245,7 +4337,7 @@
       </w:rPr>
     </w:lvl>
   </w:abstractNum>
-  <w:abstractNum w:abstractNumId="10" w15:restartNumberingAfterBreak="0">
+  <w:abstractNum w:abstractNumId="12" w15:restartNumberingAfterBreak="0">
     <w:nsid w:val="3AA4537C"/>
     <w:multiLevelType w:val="multilevel"/>
     <w:tmpl w:val="0C5A17A6"/>
@@ -3358,7 +4450,7 @@
       </w:pPr>
     </w:lvl>
   </w:abstractNum>
-  <w:abstractNum w:abstractNumId="11" w15:restartNumberingAfterBreak="0">
+  <w:abstractNum w:abstractNumId="13" w15:restartNumberingAfterBreak="0">
     <w:nsid w:val="3FBA7411"/>
     <w:multiLevelType w:val="multilevel"/>
     <w:tmpl w:val="E4647C9A"/>
@@ -3507,7 +4599,7 @@
       </w:rPr>
     </w:lvl>
   </w:abstractNum>
-  <w:abstractNum w:abstractNumId="12" w15:restartNumberingAfterBreak="0">
+  <w:abstractNum w:abstractNumId="14" w15:restartNumberingAfterBreak="0">
     <w:nsid w:val="426D116C"/>
     <w:multiLevelType w:val="multilevel"/>
     <w:tmpl w:val="351266D0"/>
@@ -3656,7 +4748,7 @@
       </w:rPr>
     </w:lvl>
   </w:abstractNum>
-  <w:abstractNum w:abstractNumId="13" w15:restartNumberingAfterBreak="0">
+  <w:abstractNum w:abstractNumId="15" w15:restartNumberingAfterBreak="0">
     <w:nsid w:val="450221EF"/>
     <w:multiLevelType w:val="multilevel"/>
     <w:tmpl w:val="0AAE37AE"/>
@@ -3773,7 +4865,7 @@
       </w:pPr>
     </w:lvl>
   </w:abstractNum>
-  <w:abstractNum w:abstractNumId="14" w15:restartNumberingAfterBreak="0">
+  <w:abstractNum w:abstractNumId="16" w15:restartNumberingAfterBreak="0">
     <w:nsid w:val="45DD790E"/>
     <w:multiLevelType w:val="multilevel"/>
     <w:tmpl w:val="9F924AE8"/>
@@ -3922,7 +5014,7 @@
       </w:rPr>
     </w:lvl>
   </w:abstractNum>
-  <w:abstractNum w:abstractNumId="15" w15:restartNumberingAfterBreak="0">
+  <w:abstractNum w:abstractNumId="17" w15:restartNumberingAfterBreak="0">
     <w:nsid w:val="464A41CD"/>
     <w:multiLevelType w:val="multilevel"/>
     <w:tmpl w:val="1B281128"/>
@@ -4035,7 +5127,7 @@
       </w:pPr>
     </w:lvl>
   </w:abstractNum>
-  <w:abstractNum w:abstractNumId="16" w15:restartNumberingAfterBreak="0">
+  <w:abstractNum w:abstractNumId="18" w15:restartNumberingAfterBreak="0">
     <w:nsid w:val="4BC61ECA"/>
     <w:multiLevelType w:val="multilevel"/>
     <w:tmpl w:val="ADB69E4E"/>
@@ -4184,7 +5276,7 @@
       </w:rPr>
     </w:lvl>
   </w:abstractNum>
-  <w:abstractNum w:abstractNumId="17" w15:restartNumberingAfterBreak="0">
+  <w:abstractNum w:abstractNumId="19" w15:restartNumberingAfterBreak="0">
     <w:nsid w:val="4D056C3F"/>
     <w:multiLevelType w:val="multilevel"/>
     <w:tmpl w:val="EC806AD0"/>
@@ -4297,7 +5389,7 @@
       </w:pPr>
     </w:lvl>
   </w:abstractNum>
-  <w:abstractNum w:abstractNumId="18" w15:restartNumberingAfterBreak="0">
+  <w:abstractNum w:abstractNumId="20" w15:restartNumberingAfterBreak="0">
     <w:nsid w:val="515E57F4"/>
     <w:multiLevelType w:val="multilevel"/>
     <w:tmpl w:val="FEA81A34"/>
@@ -4410,7 +5502,7 @@
       </w:pPr>
     </w:lvl>
   </w:abstractNum>
-  <w:abstractNum w:abstractNumId="19" w15:restartNumberingAfterBreak="0">
+  <w:abstractNum w:abstractNumId="21" w15:restartNumberingAfterBreak="0">
     <w:nsid w:val="529611FB"/>
     <w:multiLevelType w:val="hybridMultilevel"/>
     <w:tmpl w:val="CF265A78"/>
@@ -4499,7 +5591,7 @@
       </w:pPr>
     </w:lvl>
   </w:abstractNum>
-  <w:abstractNum w:abstractNumId="20" w15:restartNumberingAfterBreak="0">
+  <w:abstractNum w:abstractNumId="22" w15:restartNumberingAfterBreak="0">
     <w:nsid w:val="59DF0E59"/>
     <w:multiLevelType w:val="multilevel"/>
     <w:tmpl w:val="2B68B7AC"/>
@@ -4648,7 +5740,7 @@
       </w:rPr>
     </w:lvl>
   </w:abstractNum>
-  <w:abstractNum w:abstractNumId="21" w15:restartNumberingAfterBreak="0">
+  <w:abstractNum w:abstractNumId="23" w15:restartNumberingAfterBreak="0">
     <w:nsid w:val="5CE57D39"/>
     <w:multiLevelType w:val="multilevel"/>
     <w:tmpl w:val="9D6230F6"/>
@@ -4797,7 +5889,7 @@
       </w:rPr>
     </w:lvl>
   </w:abstractNum>
-  <w:abstractNum w:abstractNumId="22" w15:restartNumberingAfterBreak="0">
+  <w:abstractNum w:abstractNumId="24" w15:restartNumberingAfterBreak="0">
     <w:nsid w:val="5EC0368E"/>
     <w:multiLevelType w:val="multilevel"/>
     <w:tmpl w:val="367A5F6A"/>
@@ -4946,7 +6038,7 @@
       </w:rPr>
     </w:lvl>
   </w:abstractNum>
-  <w:abstractNum w:abstractNumId="23" w15:restartNumberingAfterBreak="0">
+  <w:abstractNum w:abstractNumId="25" w15:restartNumberingAfterBreak="0">
     <w:nsid w:val="62A05E2B"/>
     <w:multiLevelType w:val="multilevel"/>
     <w:tmpl w:val="C7BAD7A6"/>
@@ -5095,7 +6187,7 @@
       </w:rPr>
     </w:lvl>
   </w:abstractNum>
-  <w:abstractNum w:abstractNumId="24" w15:restartNumberingAfterBreak="0">
+  <w:abstractNum w:abstractNumId="26" w15:restartNumberingAfterBreak="0">
     <w:nsid w:val="64526D4E"/>
     <w:multiLevelType w:val="multilevel"/>
     <w:tmpl w:val="2B4C632A"/>
@@ -5208,7 +6300,7 @@
       </w:pPr>
     </w:lvl>
   </w:abstractNum>
-  <w:abstractNum w:abstractNumId="25" w15:restartNumberingAfterBreak="0">
+  <w:abstractNum w:abstractNumId="27" w15:restartNumberingAfterBreak="0">
     <w:nsid w:val="65EB26A7"/>
     <w:multiLevelType w:val="hybridMultilevel"/>
     <w:tmpl w:val="631463AC"/>
@@ -5297,7 +6389,7 @@
       </w:pPr>
     </w:lvl>
   </w:abstractNum>
-  <w:abstractNum w:abstractNumId="26" w15:restartNumberingAfterBreak="0">
+  <w:abstractNum w:abstractNumId="28" w15:restartNumberingAfterBreak="0">
     <w:nsid w:val="68457453"/>
     <w:multiLevelType w:val="multilevel"/>
     <w:tmpl w:val="BC6C0CC2"/>
@@ -5446,7 +6538,7 @@
       </w:rPr>
     </w:lvl>
   </w:abstractNum>
-  <w:abstractNum w:abstractNumId="27" w15:restartNumberingAfterBreak="0">
+  <w:abstractNum w:abstractNumId="29" w15:restartNumberingAfterBreak="0">
     <w:nsid w:val="685E3123"/>
     <w:multiLevelType w:val="multilevel"/>
     <w:tmpl w:val="B732A106"/>
@@ -5595,7 +6687,7 @@
       </w:rPr>
     </w:lvl>
   </w:abstractNum>
-  <w:abstractNum w:abstractNumId="28" w15:restartNumberingAfterBreak="0">
+  <w:abstractNum w:abstractNumId="30" w15:restartNumberingAfterBreak="0">
     <w:nsid w:val="7687779E"/>
     <w:multiLevelType w:val="multilevel"/>
     <w:tmpl w:val="81CC0870"/>
@@ -5744,7 +6836,156 @@
       </w:rPr>
     </w:lvl>
   </w:abstractNum>
-  <w:abstractNum w:abstractNumId="29" w15:restartNumberingAfterBreak="0">
+  <w:abstractNum w:abstractNumId="31" w15:restartNumberingAfterBreak="0">
+    <w:nsid w:val="78436AB0"/>
+    <w:multiLevelType w:val="multilevel"/>
+    <w:tmpl w:val="689EE3B0"/>
+    <w:lvl w:ilvl="0">
+      <w:start w:val="1"/>
+      <w:numFmt w:val="bullet"/>
+      <w:lvlText w:val=""/>
+      <w:lvlJc w:val="left"/>
+      <w:pPr>
+        <w:tabs>
+          <w:tab w:val="num" w:pos="720"/>
+        </w:tabs>
+        <w:ind w:left="720" w:hanging="360"/>
+      </w:pPr>
+      <w:rPr>
+        <w:rFonts w:ascii="Symbol" w:hAnsi="Symbol" w:hint="default"/>
+        <w:sz w:val="20"/>
+      </w:rPr>
+    </w:lvl>
+    <w:lvl w:ilvl="1" w:tentative="1">
+      <w:start w:val="1"/>
+      <w:numFmt w:val="bullet"/>
+      <w:lvlText w:val="o"/>
+      <w:lvlJc w:val="left"/>
+      <w:pPr>
+        <w:tabs>
+          <w:tab w:val="num" w:pos="1440"/>
+        </w:tabs>
+        <w:ind w:left="1440" w:hanging="360"/>
+      </w:pPr>
+      <w:rPr>
+        <w:rFonts w:ascii="Courier New" w:hAnsi="Courier New" w:hint="default"/>
+        <w:sz w:val="20"/>
+      </w:rPr>
+    </w:lvl>
+    <w:lvl w:ilvl="2" w:tentative="1">
+      <w:start w:val="1"/>
+      <w:numFmt w:val="bullet"/>
+      <w:lvlText w:val=""/>
+      <w:lvlJc w:val="left"/>
+      <w:pPr>
+        <w:tabs>
+          <w:tab w:val="num" w:pos="2160"/>
+        </w:tabs>
+        <w:ind w:left="2160" w:hanging="360"/>
+      </w:pPr>
+      <w:rPr>
+        <w:rFonts w:ascii="Wingdings" w:hAnsi="Wingdings" w:hint="default"/>
+        <w:sz w:val="20"/>
+      </w:rPr>
+    </w:lvl>
+    <w:lvl w:ilvl="3" w:tentative="1">
+      <w:start w:val="1"/>
+      <w:numFmt w:val="bullet"/>
+      <w:lvlText w:val=""/>
+      <w:lvlJc w:val="left"/>
+      <w:pPr>
+        <w:tabs>
+          <w:tab w:val="num" w:pos="2880"/>
+        </w:tabs>
+        <w:ind w:left="2880" w:hanging="360"/>
+      </w:pPr>
+      <w:rPr>
+        <w:rFonts w:ascii="Wingdings" w:hAnsi="Wingdings" w:hint="default"/>
+        <w:sz w:val="20"/>
+      </w:rPr>
+    </w:lvl>
+    <w:lvl w:ilvl="4" w:tentative="1">
+      <w:start w:val="1"/>
+      <w:numFmt w:val="bullet"/>
+      <w:lvlText w:val=""/>
+      <w:lvlJc w:val="left"/>
+      <w:pPr>
+        <w:tabs>
+          <w:tab w:val="num" w:pos="3600"/>
+        </w:tabs>
+        <w:ind w:left="3600" w:hanging="360"/>
+      </w:pPr>
+      <w:rPr>
+        <w:rFonts w:ascii="Wingdings" w:hAnsi="Wingdings" w:hint="default"/>
+        <w:sz w:val="20"/>
+      </w:rPr>
+    </w:lvl>
+    <w:lvl w:ilvl="5" w:tentative="1">
+      <w:start w:val="1"/>
+      <w:numFmt w:val="bullet"/>
+      <w:lvlText w:val=""/>
+      <w:lvlJc w:val="left"/>
+      <w:pPr>
+        <w:tabs>
+          <w:tab w:val="num" w:pos="4320"/>
+        </w:tabs>
+        <w:ind w:left="4320" w:hanging="360"/>
+      </w:pPr>
+      <w:rPr>
+        <w:rFonts w:ascii="Wingdings" w:hAnsi="Wingdings" w:hint="default"/>
+        <w:sz w:val="20"/>
+      </w:rPr>
+    </w:lvl>
+    <w:lvl w:ilvl="6" w:tentative="1">
+      <w:start w:val="1"/>
+      <w:numFmt w:val="bullet"/>
+      <w:lvlText w:val=""/>
+      <w:lvlJc w:val="left"/>
+      <w:pPr>
+        <w:tabs>
+          <w:tab w:val="num" w:pos="5040"/>
+        </w:tabs>
+        <w:ind w:left="5040" w:hanging="360"/>
+      </w:pPr>
+      <w:rPr>
+        <w:rFonts w:ascii="Wingdings" w:hAnsi="Wingdings" w:hint="default"/>
+        <w:sz w:val="20"/>
+      </w:rPr>
+    </w:lvl>
+    <w:lvl w:ilvl="7" w:tentative="1">
+      <w:start w:val="1"/>
+      <w:numFmt w:val="bullet"/>
+      <w:lvlText w:val=""/>
+      <w:lvlJc w:val="left"/>
+      <w:pPr>
+        <w:tabs>
+          <w:tab w:val="num" w:pos="5760"/>
+        </w:tabs>
+        <w:ind w:left="5760" w:hanging="360"/>
+      </w:pPr>
+      <w:rPr>
+        <w:rFonts w:ascii="Wingdings" w:hAnsi="Wingdings" w:hint="default"/>
+        <w:sz w:val="20"/>
+      </w:rPr>
+    </w:lvl>
+    <w:lvl w:ilvl="8" w:tentative="1">
+      <w:start w:val="1"/>
+      <w:numFmt w:val="bullet"/>
+      <w:lvlText w:val=""/>
+      <w:lvlJc w:val="left"/>
+      <w:pPr>
+        <w:tabs>
+          <w:tab w:val="num" w:pos="6480"/>
+        </w:tabs>
+        <w:ind w:left="6480" w:hanging="360"/>
+      </w:pPr>
+      <w:rPr>
+        <w:rFonts w:ascii="Wingdings" w:hAnsi="Wingdings" w:hint="default"/>
+        <w:sz w:val="20"/>
+      </w:rPr>
+    </w:lvl>
+  </w:abstractNum>
+  <w:abstractNum w:abstractNumId="32" w15:restartNumberingAfterBreak="0">
     <w:nsid w:val="7CEE040A"/>
     <w:multiLevelType w:val="multilevel"/>
     <w:tmpl w:val="5B80D0E2"/>
@@ -5893,7 +7134,7 @@
       </w:rPr>
     </w:lvl>
   </w:abstractNum>
-  <w:abstractNum w:abstractNumId="30" w15:restartNumberingAfterBreak="0">
+  <w:abstractNum w:abstractNumId="33" w15:restartNumberingAfterBreak="0">
     <w:nsid w:val="7CEF1DA2"/>
     <w:multiLevelType w:val="multilevel"/>
     <w:tmpl w:val="FD322D9C"/>
@@ -6006,7 +7247,7 @@
       </w:pPr>
     </w:lvl>
   </w:abstractNum>
-  <w:abstractNum w:abstractNumId="31" w15:restartNumberingAfterBreak="0">
+  <w:abstractNum w:abstractNumId="34" w15:restartNumberingAfterBreak="0">
     <w:nsid w:val="7E0F60F7"/>
     <w:multiLevelType w:val="multilevel"/>
     <w:tmpl w:val="5C3823D6"/>
@@ -6156,100 +7397,109 @@
     </w:lvl>
   </w:abstractNum>
   <w:num w:numId="1">
+    <w:abstractNumId w:val="26"/>
+  </w:num>
+  <w:num w:numId="2">
+    <w:abstractNumId w:val="33"/>
+  </w:num>
+  <w:num w:numId="3">
+    <w:abstractNumId w:val="19"/>
+  </w:num>
+  <w:num w:numId="4">
+    <w:abstractNumId w:val="27"/>
+  </w:num>
+  <w:num w:numId="5">
+    <w:abstractNumId w:val="21"/>
+  </w:num>
+  <w:num w:numId="6">
+    <w:abstractNumId w:val="10"/>
+  </w:num>
+  <w:num w:numId="7">
+    <w:abstractNumId w:val="15"/>
+  </w:num>
+  <w:num w:numId="8">
+    <w:abstractNumId w:val="17"/>
+  </w:num>
+  <w:num w:numId="9">
+    <w:abstractNumId w:val="9"/>
+  </w:num>
+  <w:num w:numId="10">
     <w:abstractNumId w:val="24"/>
   </w:num>
-  <w:num w:numId="2">
+  <w:num w:numId="11">
+    <w:abstractNumId w:val="5"/>
+  </w:num>
+  <w:num w:numId="12">
+    <w:abstractNumId w:val="25"/>
+  </w:num>
+  <w:num w:numId="13">
+    <w:abstractNumId w:val="20"/>
+  </w:num>
+  <w:num w:numId="14">
+    <w:abstractNumId w:val="28"/>
+  </w:num>
+  <w:num w:numId="15">
+    <w:abstractNumId w:val="34"/>
+  </w:num>
+  <w:num w:numId="16">
+    <w:abstractNumId w:val="22"/>
+  </w:num>
+  <w:num w:numId="17">
+    <w:abstractNumId w:val="18"/>
+  </w:num>
+  <w:num w:numId="18">
+    <w:abstractNumId w:val="11"/>
+  </w:num>
+  <w:num w:numId="19">
+    <w:abstractNumId w:val="1"/>
+  </w:num>
+  <w:num w:numId="20">
+    <w:abstractNumId w:val="14"/>
+  </w:num>
+  <w:num w:numId="21">
+    <w:abstractNumId w:val="4"/>
+  </w:num>
+  <w:num w:numId="22">
+    <w:abstractNumId w:val="2"/>
+  </w:num>
+  <w:num w:numId="23">
+    <w:abstractNumId w:val="6"/>
+  </w:num>
+  <w:num w:numId="24">
+    <w:abstractNumId w:val="12"/>
+  </w:num>
+  <w:num w:numId="25">
+    <w:abstractNumId w:val="16"/>
+  </w:num>
+  <w:num w:numId="26">
+    <w:abstractNumId w:val="7"/>
+  </w:num>
+  <w:num w:numId="27">
+    <w:abstractNumId w:val="13"/>
+  </w:num>
+  <w:num w:numId="28">
+    <w:abstractNumId w:val="23"/>
+  </w:num>
+  <w:num w:numId="29">
+    <w:abstractNumId w:val="29"/>
+  </w:num>
+  <w:num w:numId="30">
     <w:abstractNumId w:val="30"/>
   </w:num>
-  <w:num w:numId="3">
-    <w:abstractNumId w:val="17"/>
+  <w:num w:numId="31">
+    <w:abstractNumId w:val="32"/>
   </w:num>
-  <w:num w:numId="4">
-    <w:abstractNumId w:val="25"/>
-  </w:num>
-  <w:num w:numId="5">
-    <w:abstractNumId w:val="19"/>
-  </w:num>
-  <w:num w:numId="6">
+  <w:num w:numId="32">
     <w:abstractNumId w:val="8"/>
   </w:num>
-  <w:num w:numId="7">
-    <w:abstractNumId w:val="13"/>
-  </w:num>
-  <w:num w:numId="8">
-    <w:abstractNumId w:val="15"/>
-  </w:num>
-  <w:num w:numId="9">
-    <w:abstractNumId w:val="7"/>
-  </w:num>
-  <w:num w:numId="10">
-    <w:abstractNumId w:val="22"/>
-  </w:num>
-  <w:num w:numId="11">
+  <w:num w:numId="33">
     <w:abstractNumId w:val="3"/>
   </w:num>
-  <w:num w:numId="12">
-    <w:abstractNumId w:val="23"/>
-  </w:num>
-  <w:num w:numId="13">
-    <w:abstractNumId w:val="18"/>
-  </w:num>
-  <w:num w:numId="14">
-    <w:abstractNumId w:val="26"/>
-  </w:num>
-  <w:num w:numId="15">
-    <w:abstractNumId w:val="31"/>
-  </w:num>
-  <w:num w:numId="16">
-    <w:abstractNumId w:val="20"/>
-  </w:num>
-  <w:num w:numId="17">
-    <w:abstractNumId w:val="16"/>
-  </w:num>
-  <w:num w:numId="18">
-    <w:abstractNumId w:val="9"/>
-  </w:num>
-  <w:num w:numId="19">
+  <w:num w:numId="34">
     <w:abstractNumId w:val="0"/>
   </w:num>
-  <w:num w:numId="20">
-    <w:abstractNumId w:val="12"/>
-  </w:num>
-  <w:num w:numId="21">
-    <w:abstractNumId w:val="2"/>
-  </w:num>
-  <w:num w:numId="22">
-    <w:abstractNumId w:val="1"/>
-  </w:num>
-  <w:num w:numId="23">
-    <w:abstractNumId w:val="4"/>
-  </w:num>
-  <w:num w:numId="24">
-    <w:abstractNumId w:val="10"/>
-  </w:num>
-  <w:num w:numId="25">
-    <w:abstractNumId w:val="14"/>
-  </w:num>
-  <w:num w:numId="26">
-    <w:abstractNumId w:val="5"/>
-  </w:num>
-  <w:num w:numId="27">
-    <w:abstractNumId w:val="11"/>
-  </w:num>
-  <w:num w:numId="28">
-    <w:abstractNumId w:val="21"/>
-  </w:num>
-  <w:num w:numId="29">
-    <w:abstractNumId w:val="27"/>
-  </w:num>
-  <w:num w:numId="30">
-    <w:abstractNumId w:val="28"/>
-  </w:num>
-  <w:num w:numId="31">
-    <w:abstractNumId w:val="29"/>
-  </w:num>
-  <w:num w:numId="32">
-    <w:abstractNumId w:val="6"/>
+  <w:num w:numId="35">
+    <w:abstractNumId w:val="31"/>
   </w:num>
 </w:numbering>
 </file>

</xml_diff>